<commit_message>
feat: Implement initial user authentication and establish core multi-platform (MAUI/Web) application structure.
</commit_message>
<xml_diff>
--- a/Documentation/VIGOR-Rapport.docx
+++ b/Documentation/VIGOR-Rapport.docx
@@ -36,6 +36,288 @@
               <w:color w:val="156082" w:themeColor="accent1"/>
             </w:rPr>
           </w:pPr>
+          <w:r>
+            <w:rPr>
+              <w:b/>
+              <w:bCs/>
+              <w:noProof/>
+            </w:rPr>
+            <mc:AlternateContent>
+              <mc:Choice Requires="wps">
+                <w:drawing>
+                  <wp:anchor distT="45720" distB="45720" distL="114300" distR="114300" simplePos="0" relativeHeight="251661312" behindDoc="0" locked="0" layoutInCell="1" allowOverlap="1" wp14:anchorId="0CC3DA34" wp14:editId="3F74AE16">
+                    <wp:simplePos x="0" y="0"/>
+                    <wp:positionH relativeFrom="column">
+                      <wp:posOffset>1203401</wp:posOffset>
+                    </wp:positionH>
+                    <wp:positionV relativeFrom="paragraph">
+                      <wp:posOffset>2665095</wp:posOffset>
+                    </wp:positionV>
+                    <wp:extent cx="3803015" cy="299720"/>
+                    <wp:effectExtent l="0" t="0" r="26035" b="24130"/>
+                    <wp:wrapSquare wrapText="bothSides"/>
+                    <wp:docPr id="217" name="Tekstfelt 2"/>
+                    <wp:cNvGraphicFramePr>
+                      <a:graphicFrameLocks xmlns:a="http://schemas.openxmlformats.org/drawingml/2006/main"/>
+                    </wp:cNvGraphicFramePr>
+                    <a:graphic xmlns:a="http://schemas.openxmlformats.org/drawingml/2006/main">
+                      <a:graphicData uri="http://schemas.microsoft.com/office/word/2010/wordprocessingShape">
+                        <wps:wsp>
+                          <wps:cNvSpPr txBox="1">
+                            <a:spLocks noChangeArrowheads="1"/>
+                          </wps:cNvSpPr>
+                          <wps:spPr bwMode="auto">
+                            <a:xfrm>
+                              <a:off x="0" y="0"/>
+                              <a:ext cx="3803015" cy="299720"/>
+                            </a:xfrm>
+                            <a:prstGeom prst="rect">
+                              <a:avLst/>
+                            </a:prstGeom>
+                            <a:solidFill>
+                              <a:srgbClr val="FFFFFF"/>
+                            </a:solidFill>
+                            <a:ln w="9525">
+                              <a:solidFill>
+                                <a:srgbClr val="000000"/>
+                              </a:solidFill>
+                              <a:miter lim="800000"/>
+                              <a:headEnd/>
+                              <a:tailEnd/>
+                            </a:ln>
+                          </wps:spPr>
+                          <wps:txbx>
+                            <w:txbxContent>
+                              <w:p>
+                                <w:pPr>
+                                  <w:jc w:val="center"/>
+                                  <w:rPr>
+                                    <w:b/>
+                                    <w:color w:val="196B24" w:themeColor="accent3"/>
+                                    <w:sz w:val="22"/>
+                                    <w:szCs w:val="22"/>
+                                    <w14:textOutline w14:w="0" w14:cap="flat" w14:cmpd="sng" w14:algn="ctr">
+                                      <w14:noFill/>
+                                      <w14:prstDash w14:val="solid"/>
+                                      <w14:round/>
+                                    </w14:textOutline>
+                                    <w14:props3d w14:extrusionH="57150" w14:contourW="0" w14:prstMaterial="matte">
+                                      <w14:bevelT w14:w="63500" w14:h="12700" w14:prst="angle"/>
+                                      <w14:contourClr>
+                                        <w14:schemeClr w14:val="bg1">
+                                          <w14:lumMod w14:val="65000"/>
+                                        </w14:schemeClr>
+                                      </w14:contourClr>
+                                    </w14:props3d>
+                                  </w:rPr>
+                                </w:pPr>
+                                <w:r>
+                                  <w:rPr>
+                                    <w:b/>
+                                    <w:color w:val="196B24" w:themeColor="accent3"/>
+                                    <w:sz w:val="22"/>
+                                    <w:szCs w:val="22"/>
+                                    <w14:textOutline w14:w="0" w14:cap="flat" w14:cmpd="sng" w14:algn="ctr">
+                                      <w14:noFill/>
+                                      <w14:prstDash w14:val="solid"/>
+                                      <w14:round/>
+                                    </w14:textOutline>
+                                    <w14:props3d w14:extrusionH="57150" w14:contourW="0" w14:prstMaterial="matte">
+                                      <w14:bevelT w14:w="63500" w14:h="12700" w14:prst="angle"/>
+                                      <w14:contourClr>
+                                        <w14:schemeClr w14:val="bg1">
+                                          <w14:lumMod w14:val="65000"/>
+                                        </w14:schemeClr>
+                                      </w14:contourClr>
+                                    </w14:props3d>
+                                  </w:rPr>
+                                  <w:t xml:space="preserve">Visual Integrated </w:t>
+                                </w:r>
+                                <w:proofErr w:type="spellStart"/>
+                                <w:r>
+                                  <w:rPr>
+                                    <w:b/>
+                                    <w:color w:val="196B24" w:themeColor="accent3"/>
+                                    <w:sz w:val="22"/>
+                                    <w:szCs w:val="22"/>
+                                    <w14:textOutline w14:w="0" w14:cap="flat" w14:cmpd="sng" w14:algn="ctr">
+                                      <w14:noFill/>
+                                      <w14:prstDash w14:val="solid"/>
+                                      <w14:round/>
+                                    </w14:textOutline>
+                                    <w14:props3d w14:extrusionH="57150" w14:contourW="0" w14:prstMaterial="matte">
+                                      <w14:bevelT w14:w="63500" w14:h="12700" w14:prst="angle"/>
+                                      <w14:contourClr>
+                                        <w14:schemeClr w14:val="bg1">
+                                          <w14:lumMod w14:val="65000"/>
+                                        </w14:schemeClr>
+                                      </w14:contourClr>
+                                    </w14:props3d>
+                                  </w:rPr>
+                                  <w:t>Governance</w:t>
+                                </w:r>
+                                <w:proofErr w:type="spellEnd"/>
+                                <w:r>
+                                  <w:rPr>
+                                    <w:b/>
+                                    <w:color w:val="196B24" w:themeColor="accent3"/>
+                                    <w:sz w:val="22"/>
+                                    <w:szCs w:val="22"/>
+                                    <w14:textOutline w14:w="0" w14:cap="flat" w14:cmpd="sng" w14:algn="ctr">
+                                      <w14:noFill/>
+                                      <w14:prstDash w14:val="solid"/>
+                                      <w14:round/>
+                                    </w14:textOutline>
+                                    <w14:props3d w14:extrusionH="57150" w14:contourW="0" w14:prstMaterial="matte">
+                                      <w14:bevelT w14:w="63500" w14:h="12700" w14:prst="angle"/>
+                                      <w14:contourClr>
+                                        <w14:schemeClr w14:val="bg1">
+                                          <w14:lumMod w14:val="65000"/>
+                                        </w14:schemeClr>
+                                      </w14:contourClr>
+                                    </w14:props3d>
+                                  </w:rPr>
+                                  <w:t xml:space="preserve"> &amp; Overlap Registry</w:t>
+                                </w:r>
+                              </w:p>
+                            </w:txbxContent>
+                          </wps:txbx>
+                          <wps:bodyPr rot="0" vert="horz" wrap="square" lIns="91440" tIns="45720" rIns="91440" bIns="45720" anchor="t" anchorCtr="0">
+                            <a:noAutofit/>
+                            <a:scene3d>
+                              <a:camera prst="orthographicFront"/>
+                              <a:lightRig rig="harsh" dir="t"/>
+                            </a:scene3d>
+                            <a:sp3d extrusionH="57150" prstMaterial="matte">
+                              <a:bevelT w="63500" h="12700" prst="angle"/>
+                              <a:contourClr>
+                                <a:schemeClr val="bg1">
+                                  <a:lumMod val="65000"/>
+                                </a:schemeClr>
+                              </a:contourClr>
+                            </a:sp3d>
+                          </wps:bodyPr>
+                        </wps:wsp>
+                      </a:graphicData>
+                    </a:graphic>
+                    <wp14:sizeRelH relativeFrom="margin">
+                      <wp14:pctWidth>0</wp14:pctWidth>
+                    </wp14:sizeRelH>
+                    <wp14:sizeRelV relativeFrom="margin">
+                      <wp14:pctHeight>0</wp14:pctHeight>
+                    </wp14:sizeRelV>
+                  </wp:anchor>
+                </w:drawing>
+              </mc:Choice>
+              <mc:Fallback>
+                <w:pict>
+                  <v:shapetype w14:anchorId="0CC3DA34" id="_x0000_t202" coordsize="21600,21600" o:spt="202" path="m,l,21600r21600,l21600,xe">
+                    <v:stroke joinstyle="miter"/>
+                    <v:path gradientshapeok="t" o:connecttype="rect"/>
+                  </v:shapetype>
+                  <v:shape id="Tekstfelt 2" o:spid="_x0000_s1026" type="#_x0000_t202" style="position:absolute;left:0;text-align:left;margin-left:94.75pt;margin-top:209.85pt;width:299.45pt;height:23.6pt;z-index:251661312;visibility:visible;mso-wrap-style:square;mso-width-percent:0;mso-height-percent:0;mso-wrap-distance-left:9pt;mso-wrap-distance-top:3.6pt;mso-wrap-distance-right:9pt;mso-wrap-distance-bottom:3.6pt;mso-position-horizontal:absolute;mso-position-horizontal-relative:text;mso-position-vertical:absolute;mso-position-vertical-relative:text;mso-width-percent:0;mso-height-percent:0;mso-width-relative:margin;mso-height-relative:margin;v-text-anchor:top" o:gfxdata="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">
+                    <v:textbox>
+                      <w:txbxContent>
+                        <w:p>
+                          <w:pPr>
+                            <w:jc w:val="center"/>
+                            <w:rPr>
+                              <w:b/>
+                              <w:color w:val="196B24" w:themeColor="accent3"/>
+                              <w:sz w:val="22"/>
+                              <w:szCs w:val="22"/>
+                              <w14:textOutline w14:w="0" w14:cap="flat" w14:cmpd="sng" w14:algn="ctr">
+                                <w14:noFill/>
+                                <w14:prstDash w14:val="solid"/>
+                                <w14:round/>
+                              </w14:textOutline>
+                              <w14:props3d w14:extrusionH="57150" w14:contourW="0" w14:prstMaterial="matte">
+                                <w14:bevelT w14:w="63500" w14:h="12700" w14:prst="angle"/>
+                                <w14:contourClr>
+                                  <w14:schemeClr w14:val="bg1">
+                                    <w14:lumMod w14:val="65000"/>
+                                  </w14:schemeClr>
+                                </w14:contourClr>
+                              </w14:props3d>
+                            </w:rPr>
+                          </w:pPr>
+                          <w:r>
+                            <w:rPr>
+                              <w:b/>
+                              <w:color w:val="196B24" w:themeColor="accent3"/>
+                              <w:sz w:val="22"/>
+                              <w:szCs w:val="22"/>
+                              <w14:textOutline w14:w="0" w14:cap="flat" w14:cmpd="sng" w14:algn="ctr">
+                                <w14:noFill/>
+                                <w14:prstDash w14:val="solid"/>
+                                <w14:round/>
+                              </w14:textOutline>
+                              <w14:props3d w14:extrusionH="57150" w14:contourW="0" w14:prstMaterial="matte">
+                                <w14:bevelT w14:w="63500" w14:h="12700" w14:prst="angle"/>
+                                <w14:contourClr>
+                                  <w14:schemeClr w14:val="bg1">
+                                    <w14:lumMod w14:val="65000"/>
+                                  </w14:schemeClr>
+                                </w14:contourClr>
+                              </w14:props3d>
+                            </w:rPr>
+                            <w:t xml:space="preserve">Visual Integrated </w:t>
+                          </w:r>
+                          <w:proofErr w:type="spellStart"/>
+                          <w:r>
+                            <w:rPr>
+                              <w:b/>
+                              <w:color w:val="196B24" w:themeColor="accent3"/>
+                              <w:sz w:val="22"/>
+                              <w:szCs w:val="22"/>
+                              <w14:textOutline w14:w="0" w14:cap="flat" w14:cmpd="sng" w14:algn="ctr">
+                                <w14:noFill/>
+                                <w14:prstDash w14:val="solid"/>
+                                <w14:round/>
+                              </w14:textOutline>
+                              <w14:props3d w14:extrusionH="57150" w14:contourW="0" w14:prstMaterial="matte">
+                                <w14:bevelT w14:w="63500" w14:h="12700" w14:prst="angle"/>
+                                <w14:contourClr>
+                                  <w14:schemeClr w14:val="bg1">
+                                    <w14:lumMod w14:val="65000"/>
+                                  </w14:schemeClr>
+                                </w14:contourClr>
+                              </w14:props3d>
+                            </w:rPr>
+                            <w:t>Governance</w:t>
+                          </w:r>
+                          <w:proofErr w:type="spellEnd"/>
+                          <w:r>
+                            <w:rPr>
+                              <w:b/>
+                              <w:color w:val="196B24" w:themeColor="accent3"/>
+                              <w:sz w:val="22"/>
+                              <w:szCs w:val="22"/>
+                              <w14:textOutline w14:w="0" w14:cap="flat" w14:cmpd="sng" w14:algn="ctr">
+                                <w14:noFill/>
+                                <w14:prstDash w14:val="solid"/>
+                                <w14:round/>
+                              </w14:textOutline>
+                              <w14:props3d w14:extrusionH="57150" w14:contourW="0" w14:prstMaterial="matte">
+                                <w14:bevelT w14:w="63500" w14:h="12700" w14:prst="angle"/>
+                                <w14:contourClr>
+                                  <w14:schemeClr w14:val="bg1">
+                                    <w14:lumMod w14:val="65000"/>
+                                  </w14:schemeClr>
+                                </w14:contourClr>
+                              </w14:props3d>
+                            </w:rPr>
+                            <w:t xml:space="preserve"> &amp; Overlap Registry</w:t>
+                          </w:r>
+                        </w:p>
+                      </w:txbxContent>
+                    </v:textbox>
+                    <w10:wrap type="square"/>
+                  </v:shape>
+                </w:pict>
+              </mc:Fallback>
+            </mc:AlternateContent>
+          </w:r>
           <w:r>
             <w:rPr>
               <w:noProof/>
@@ -145,7 +427,7 @@
                   <w:sz w:val="72"/>
                   <w:szCs w:val="72"/>
                 </w:rPr>
-                <w:t>Digitalt overlapsystem</w:t>
+                <w:t>VIGOR</w:t>
               </w:r>
             </w:p>
           </w:sdtContent>
@@ -167,25 +449,44 @@
             <w:text/>
           </w:sdtPr>
           <w:sdtContent>
-            <w:p>
-              <w:pPr>
-                <w:pStyle w:val="Ingenafstand"/>
-                <w:jc w:val="center"/>
+            <w:sdt>
+              <w:sdtPr>
                 <w:rPr>
                   <w:color w:val="156082" w:themeColor="accent1"/>
                   <w:sz w:val="28"/>
                   <w:szCs w:val="28"/>
                 </w:rPr>
-              </w:pPr>
-              <w:r>
-                <w:rPr>
-                  <w:color w:val="156082" w:themeColor="accent1"/>
-                  <w:sz w:val="28"/>
-                  <w:szCs w:val="28"/>
-                </w:rPr>
-                <w:t>Projektrapport</w:t>
-              </w:r>
-            </w:p>
+                <w:alias w:val="Undertitel"/>
+                <w:tag w:val=""/>
+                <w:id w:val="1505550948"/>
+                <w:placeholder>
+                  <w:docPart w:val="192772CA5CE345D5A3E09088CBF89600"/>
+                </w:placeholder>
+                <w:dataBinding w:prefixMappings="xmlns:ns0='http://purl.org/dc/elements/1.1/' xmlns:ns1='http://schemas.openxmlformats.org/package/2006/metadata/core-properties' " w:xpath="/ns1:coreProperties[1]/ns0:subject[1]" w:storeItemID="{6C3C8BC8-F283-45AE-878A-BAB7291924A1}"/>
+                <w:text/>
+              </w:sdtPr>
+              <w:sdtContent>
+                <w:p>
+                  <w:pPr>
+                    <w:pStyle w:val="Ingenafstand"/>
+                    <w:jc w:val="center"/>
+                    <w:rPr>
+                      <w:color w:val="156082" w:themeColor="accent1"/>
+                      <w:sz w:val="28"/>
+                      <w:szCs w:val="28"/>
+                    </w:rPr>
+                  </w:pPr>
+                  <w:r>
+                    <w:rPr>
+                      <w:color w:val="156082" w:themeColor="accent1"/>
+                      <w:sz w:val="28"/>
+                      <w:szCs w:val="28"/>
+                    </w:rPr>
+                    <w:t>Projektrapport</w:t>
+                  </w:r>
+                </w:p>
+              </w:sdtContent>
+            </w:sdt>
           </w:sdtContent>
         </w:sdt>
         <w:p>
@@ -388,11 +689,7 @@
               </mc:Choice>
               <mc:Fallback>
                 <w:pict>
-                  <v:shapetype w14:anchorId="0989C3DE" id="_x0000_t202" coordsize="21600,21600" o:spt="202" path="m,l,21600r21600,l21600,xe">
-                    <v:stroke joinstyle="miter"/>
-                    <v:path gradientshapeok="t" o:connecttype="rect"/>
-                  </v:shapetype>
-                  <v:shape id="Tekstfelt 146" o:spid="_x0000_s1026" type="#_x0000_t202" style="position:absolute;left:0;text-align:left;margin-left:0;margin-top:0;width:516pt;height:43.9pt;z-index:251659264;visibility:visible;mso-wrap-style:square;mso-width-percent:1000;mso-height-percent:0;mso-top-percent:850;mso-wrap-distance-left:9pt;mso-wrap-distance-top:0;mso-wrap-distance-right:9pt;mso-wrap-distance-bottom:0;mso-position-horizontal:center;mso-position-horizontal-relative:margin;mso-position-vertical-relative:page;mso-width-percent:1000;mso-height-percent:0;mso-top-percent:850;mso-width-relative:margin;mso-height-relative:margin;v-text-anchor:bottom" o:gfxdata="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" filled="f" stroked="f" strokeweight=".5pt">
+                  <v:shape w14:anchorId="0989C3DE" id="Tekstfelt 146" o:spid="_x0000_s1027" type="#_x0000_t202" style="position:absolute;left:0;text-align:left;margin-left:0;margin-top:0;width:516pt;height:43.9pt;z-index:251659264;visibility:visible;mso-wrap-style:square;mso-width-percent:1000;mso-height-percent:0;mso-top-percent:850;mso-wrap-distance-left:9pt;mso-wrap-distance-top:0;mso-wrap-distance-right:9pt;mso-wrap-distance-bottom:0;mso-position-horizontal:center;mso-position-horizontal-relative:margin;mso-position-vertical-relative:page;mso-width-percent:1000;mso-height-percent:0;mso-top-percent:850;mso-width-relative:margin;mso-height-relative:margin;v-text-anchor:bottom" o:gfxdata="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" filled="f" stroked="f" strokeweight=".5pt">
                     <v:textbox style="mso-fit-shape-to-text:t" inset="0,0,0,0">
                       <w:txbxContent>
                         <w:sdt>
@@ -5396,7 +5693,23 @@
                 <w:noProof/>
                 <w:lang w:val="en-US"/>
               </w:rPr>
-              <w:t>Brief Use Cases</w:t>
+              <w:t>Brief Use Cas</w:t>
+            </w:r>
+            <w:r>
+              <w:rPr>
+                <w:rStyle w:val="Hyperlink"/>
+                <w:noProof/>
+                <w:lang w:val="en-US"/>
+              </w:rPr>
+              <w:t>e</w:t>
+            </w:r>
+            <w:r>
+              <w:rPr>
+                <w:rStyle w:val="Hyperlink"/>
+                <w:noProof/>
+                <w:lang w:val="en-US"/>
+              </w:rPr>
+              <w:t>s</w:t>
             </w:r>
             <w:r>
               <w:rPr>
@@ -7732,7 +8045,23 @@
                 <w:noProof/>
                 <w:lang w:val="en-US"/>
               </w:rPr>
-              <w:t>Designmodeller</w:t>
+              <w:t>Designmod</w:t>
+            </w:r>
+            <w:r>
+              <w:rPr>
+                <w:rStyle w:val="Hyperlink"/>
+                <w:noProof/>
+                <w:lang w:val="en-US"/>
+              </w:rPr>
+              <w:t>e</w:t>
+            </w:r>
+            <w:r>
+              <w:rPr>
+                <w:rStyle w:val="Hyperlink"/>
+                <w:noProof/>
+                <w:lang w:val="en-US"/>
+              </w:rPr>
+              <w:t>ller</w:t>
             </w:r>
             <w:r>
               <w:rPr>
@@ -7820,7 +8149,23 @@
                 <w:noProof/>
                 <w:lang w:val="en-US"/>
               </w:rPr>
-              <w:t>Design Class Diagram (DCD)</w:t>
+              <w:t>Design Class Dia</w:t>
+            </w:r>
+            <w:r>
+              <w:rPr>
+                <w:rStyle w:val="Hyperlink"/>
+                <w:noProof/>
+                <w:lang w:val="en-US"/>
+              </w:rPr>
+              <w:t>g</w:t>
+            </w:r>
+            <w:r>
+              <w:rPr>
+                <w:rStyle w:val="Hyperlink"/>
+                <w:noProof/>
+                <w:lang w:val="en-US"/>
+              </w:rPr>
+              <w:t>ram (DCD)</w:t>
             </w:r>
             <w:r>
               <w:rPr>
@@ -12646,7 +12991,14 @@
                 <w:rStyle w:val="Hyperlink"/>
                 <w:noProof/>
               </w:rPr>
-              <w:t>Bilag</w:t>
+              <w:t>Bila</w:t>
+            </w:r>
+            <w:r>
+              <w:rPr>
+                <w:rStyle w:val="Hyperlink"/>
+                <w:noProof/>
+              </w:rPr>
+              <w:t>g</w:t>
             </w:r>
             <w:r>
               <w:rPr>
@@ -17784,207 +18136,12 @@
       <w:bookmarkEnd w:id="56"/>
     </w:p>
     <w:p>
-      <w:pPr>
-        <w:pStyle w:val="Overskrift2"/>
-      </w:pPr>
-      <w:bookmarkStart w:id="57" w:name="_Toc222403485"/>
-      <w:r>
-        <w:t>UC1 – Login</w:t>
-      </w:r>
-      <w:bookmarkEnd w:id="57"/>
-    </w:p>
-    <w:p>
-      <w:pPr>
-        <w:pStyle w:val="Overskrift2"/>
-      </w:pPr>
-      <w:bookmarkStart w:id="58" w:name="_Toc222403486"/>
-      <w:r>
-        <w:t>UC2 – Vælg vagt</w:t>
-      </w:r>
-      <w:bookmarkEnd w:id="58"/>
-    </w:p>
-    <w:p>
-      <w:pPr>
-        <w:pStyle w:val="Overskrift2"/>
-      </w:pPr>
-      <w:bookmarkStart w:id="59" w:name="_Toc222403487"/>
-      <w:r>
-        <w:t>UC3 – Opdatér risikoprofil</w:t>
-      </w:r>
-      <w:bookmarkEnd w:id="59"/>
-    </w:p>
-    <w:p>
-      <w:pPr>
-        <w:pStyle w:val="Overskrift2"/>
-      </w:pPr>
-      <w:bookmarkStart w:id="60" w:name="_Toc222403488"/>
-      <w:r>
-        <w:t>UC4 – Registrér fast medicin</w:t>
-      </w:r>
-      <w:bookmarkEnd w:id="60"/>
-    </w:p>
-    <w:p>
-      <w:pPr>
-        <w:pStyle w:val="Overskrift2"/>
-      </w:pPr>
-      <w:bookmarkStart w:id="61" w:name="_Toc222403489"/>
-      <w:r>
-        <w:t>UC5 – Registrér PN medicin</w:t>
-      </w:r>
-      <w:bookmarkEnd w:id="61"/>
-    </w:p>
-    <w:p>
-      <w:pPr>
-        <w:pStyle w:val="Overskrift2"/>
-      </w:pPr>
-      <w:bookmarkStart w:id="62" w:name="_Toc222403490"/>
-      <w:r>
-        <w:t>UC6 – Opret note/opgave</w:t>
-      </w:r>
-      <w:bookmarkEnd w:id="62"/>
-    </w:p>
-    <w:p>
-      <w:pPr>
-        <w:pStyle w:val="Overskrift2"/>
-      </w:pPr>
-      <w:bookmarkStart w:id="63" w:name="_Toc222403491"/>
-      <w:r>
-        <w:t>UC7 – Se historik</w:t>
-      </w:r>
-      <w:bookmarkEnd w:id="63"/>
-    </w:p>
-    <w:p>
-      <w:pPr>
-        <w:pStyle w:val="Overskrift2"/>
-        <w:rPr>
-          <w:lang w:val="en-US"/>
-        </w:rPr>
-      </w:pPr>
-      <w:bookmarkStart w:id="64" w:name="_Toc222403492"/>
-      <w:r>
-        <w:rPr>
-          <w:lang w:val="en-US"/>
-        </w:rPr>
-        <w:t xml:space="preserve">UC8 – </w:t>
-      </w:r>
-      <w:proofErr w:type="spellStart"/>
-      <w:r>
-        <w:rPr>
-          <w:lang w:val="en-US"/>
-        </w:rPr>
-        <w:t>Tildel</w:t>
-      </w:r>
-      <w:proofErr w:type="spellEnd"/>
-      <w:r>
-        <w:rPr>
-          <w:lang w:val="en-US"/>
-        </w:rPr>
-        <w:t xml:space="preserve"> </w:t>
-      </w:r>
-      <w:proofErr w:type="spellStart"/>
-      <w:r>
-        <w:rPr>
-          <w:lang w:val="en-US"/>
-        </w:rPr>
-        <w:t>personale</w:t>
-      </w:r>
-      <w:bookmarkEnd w:id="64"/>
-      <w:proofErr w:type="spellEnd"/>
-    </w:p>
-    <w:p>
-      <w:pPr>
-        <w:pStyle w:val="Overskrift2"/>
-        <w:rPr>
-          <w:lang w:val="en-US"/>
-        </w:rPr>
-      </w:pPr>
-      <w:bookmarkStart w:id="65" w:name="_Toc222403493"/>
-      <w:r>
-        <w:rPr>
-          <w:lang w:val="en-US"/>
-        </w:rPr>
-        <w:t>Fully Dressed Use Cases</w:t>
-      </w:r>
-      <w:bookmarkEnd w:id="65"/>
-    </w:p>
-    <w:p>
-      <w:pPr>
-        <w:pStyle w:val="Overskrift2"/>
-      </w:pPr>
-      <w:bookmarkStart w:id="66" w:name="_Toc222403494"/>
-      <w:r>
-        <w:t>Registrér fast medicin</w:t>
-      </w:r>
-      <w:bookmarkEnd w:id="66"/>
-    </w:p>
-    <w:p>
-      <w:pPr>
-        <w:pStyle w:val="Overskrift2"/>
-      </w:pPr>
-      <w:bookmarkStart w:id="67" w:name="_Toc222403495"/>
-      <w:r>
-        <w:t>Opdatér risikoprofil</w:t>
-      </w:r>
-      <w:bookmarkEnd w:id="67"/>
-    </w:p>
-    <w:p>
-      <w:pPr>
-        <w:pStyle w:val="Overskrift2"/>
-      </w:pPr>
-      <w:bookmarkStart w:id="68" w:name="_Toc222403496"/>
-      <w:r>
-        <w:t>Vagtskifte</w:t>
-      </w:r>
-      <w:bookmarkEnd w:id="68"/>
-    </w:p>
-    <w:p>
-      <w:r>
-        <w:pict w14:anchorId="0E3C6F81">
-          <v:rect id="_x0000_i1034" style="width:0;height:1.5pt" o:hralign="center" o:hrstd="t" o:hr="t" fillcolor="#a0a0a0" stroked="f"/>
-        </w:pict>
-      </w:r>
-    </w:p>
-    <w:p>
-      <w:pPr>
-        <w:pStyle w:val="Overskrift1"/>
-      </w:pPr>
-      <w:bookmarkStart w:id="69" w:name="_Toc222403497"/>
-      <w:r>
-        <w:t>Domænemodel og Analyse</w:t>
-      </w:r>
-      <w:bookmarkEnd w:id="69"/>
-    </w:p>
-    <w:p>
-      <w:pPr>
-        <w:pStyle w:val="Overskrift2"/>
-      </w:pPr>
-      <w:bookmarkStart w:id="70" w:name="_Toc222403498"/>
-      <w:r>
-        <w:t>Domænemodel (Analysemodel)</w:t>
-      </w:r>
-      <w:bookmarkEnd w:id="70"/>
-    </w:p>
-    <w:p>
-      <w:r>
-        <w:t>Domænemodellen viser de centrale begreber i overlapsystemets domæne samt relationerne mellem dem. Modellen er konceptuel og indeholder udelukkende forretningsmæssige begreber uden tekniske detaljer. Den illustrerer sammenhængen mellem borgere, vagter (Shift), overlap, statusregistreringer (</w:t>
-      </w:r>
-      <w:proofErr w:type="spellStart"/>
-      <w:r>
-        <w:t>CitizenStatus</w:t>
-      </w:r>
-      <w:proofErr w:type="spellEnd"/>
-      <w:r>
-        <w:t>), medicinhåndtering samt medarbejdere og organisatorisk struktur. Formålet er at skabe en fælles forståelse af domænet før design og implementering.</w:t>
-      </w:r>
-    </w:p>
-    <w:p>
-      <w:r>
-        <w:lastRenderedPageBreak/>
+      <w:r>
         <w:drawing>
-          <wp:inline distT="0" distB="0" distL="0" distR="0" wp14:anchorId="46D9F964" wp14:editId="28E1A88A">
-            <wp:extent cx="3277209" cy="3208863"/>
-            <wp:effectExtent l="0" t="0" r="0" b="0"/>
-            <wp:docPr id="953624341" name="Billede 1" descr="Et billede, der indeholder tekst, diagram, Plan, Teknisk tegning&#10;&#10;AI-genereret indhold kan være ukorrekt."/>
+          <wp:inline distT="0" distB="0" distL="0" distR="0" wp14:anchorId="64FF132E" wp14:editId="3D60AD76">
+            <wp:extent cx="1923897" cy="2178628"/>
+            <wp:effectExtent l="0" t="0" r="635" b="0"/>
+            <wp:docPr id="1928435587" name="Billede 1" descr="Et billede, der indeholder tekst, skærmbillede, Font/skrifttype, nummer/tal&#10;&#10;AI-genereret indhold kan være ukorrekt."/>
             <wp:cNvGraphicFramePr>
               <a:graphicFrameLocks xmlns:a="http://schemas.openxmlformats.org/drawingml/2006/main" noChangeAspect="1"/>
             </wp:cNvGraphicFramePr>
@@ -17992,7 +18149,7 @@
               <a:graphicData uri="http://schemas.openxmlformats.org/drawingml/2006/picture">
                 <pic:pic xmlns:pic="http://schemas.openxmlformats.org/drawingml/2006/picture">
                   <pic:nvPicPr>
-                    <pic:cNvPr id="953624341" name="Billede 1" descr="Et billede, der indeholder tekst, diagram, Plan, Teknisk tegning&#10;&#10;AI-genereret indhold kan være ukorrekt."/>
+                    <pic:cNvPr id="1928435587" name="Billede 1" descr="Et billede, der indeholder tekst, skærmbillede, Font/skrifttype, nummer/tal&#10;&#10;AI-genereret indhold kan være ukorrekt."/>
                     <pic:cNvPicPr/>
                   </pic:nvPicPr>
                   <pic:blipFill>
@@ -18004,7 +18161,7 @@
                   <pic:spPr>
                     <a:xfrm>
                       <a:off x="0" y="0"/>
-                      <a:ext cx="3289646" cy="3221041"/>
+                      <a:ext cx="1936871" cy="2193320"/>
                     </a:xfrm>
                     <a:prstGeom prst="rect">
                       <a:avLst/>
@@ -18018,24 +18175,104 @@
       </w:r>
     </w:p>
     <w:p>
+      <w:r>
+        <w:pict w14:anchorId="0E3C6F81">
+          <v:rect id="_x0000_i1034" style="width:0;height:1.5pt" o:hralign="center" o:hrstd="t" o:hr="t" fillcolor="#a0a0a0" stroked="f"/>
+        </w:pict>
+      </w:r>
+    </w:p>
+    <w:p>
+      <w:pPr>
+        <w:pStyle w:val="Overskrift1"/>
+      </w:pPr>
+      <w:bookmarkStart w:id="57" w:name="_Toc222403497"/>
+      <w:r>
+        <w:t>Domænemodel og Analyse</w:t>
+      </w:r>
+      <w:bookmarkEnd w:id="57"/>
+    </w:p>
+    <w:p>
       <w:pPr>
         <w:pStyle w:val="Overskrift2"/>
       </w:pPr>
-      <w:bookmarkStart w:id="71" w:name="_Toc222403499"/>
-      <w:r>
+      <w:bookmarkStart w:id="58" w:name="_Toc222403498"/>
+      <w:r>
+        <w:t>Domænemodel (Analysemodel)</w:t>
+      </w:r>
+      <w:bookmarkEnd w:id="58"/>
+    </w:p>
+    <w:p>
+      <w:r>
+        <w:t>Domænemodellen viser de centrale begreber i overlapsystemets domæne samt relationerne mellem dem. Modellen er konceptuel og indeholder udelukkende forretningsmæssige begreber uden tekniske detaljer. Den illustrerer sammenhængen mellem borgere, vagter (Shift), overlap, statusregistreringer (</w:t>
+      </w:r>
+      <w:proofErr w:type="spellStart"/>
+      <w:r>
+        <w:t>CitizenStatus</w:t>
+      </w:r>
+      <w:proofErr w:type="spellEnd"/>
+      <w:r>
+        <w:t>), medicinhåndtering samt medarbejdere og organisatorisk struktur. Formålet er at skabe en fælles forståelse af domænet før design og implementering.</w:t>
+      </w:r>
+    </w:p>
+    <w:p>
+      <w:r>
+        <w:drawing>
+          <wp:inline distT="0" distB="0" distL="0" distR="0" wp14:anchorId="24430D33" wp14:editId="5EC7E198">
+            <wp:extent cx="3269894" cy="3223753"/>
+            <wp:effectExtent l="0" t="0" r="6985" b="0"/>
+            <wp:docPr id="1343375845" name="Billede 1" descr="Et billede, der indeholder tekst, diagram, Plan, linje/række&#10;&#10;AI-genereret indhold kan være ukorrekt."/>
+            <wp:cNvGraphicFramePr>
+              <a:graphicFrameLocks xmlns:a="http://schemas.openxmlformats.org/drawingml/2006/main" noChangeAspect="1"/>
+            </wp:cNvGraphicFramePr>
+            <a:graphic xmlns:a="http://schemas.openxmlformats.org/drawingml/2006/main">
+              <a:graphicData uri="http://schemas.openxmlformats.org/drawingml/2006/picture">
+                <pic:pic xmlns:pic="http://schemas.openxmlformats.org/drawingml/2006/picture">
+                  <pic:nvPicPr>
+                    <pic:cNvPr id="1343375845" name="Billede 1" descr="Et billede, der indeholder tekst, diagram, Plan, linje/række&#10;&#10;AI-genereret indhold kan være ukorrekt."/>
+                    <pic:cNvPicPr/>
+                  </pic:nvPicPr>
+                  <pic:blipFill>
+                    <a:blip r:embed="rId11"/>
+                    <a:stretch>
+                      <a:fillRect/>
+                    </a:stretch>
+                  </pic:blipFill>
+                  <pic:spPr>
+                    <a:xfrm>
+                      <a:off x="0" y="0"/>
+                      <a:ext cx="3341165" cy="3294019"/>
+                    </a:xfrm>
+                    <a:prstGeom prst="rect">
+                      <a:avLst/>
+                    </a:prstGeom>
+                  </pic:spPr>
+                </pic:pic>
+              </a:graphicData>
+            </a:graphic>
+          </wp:inline>
+        </w:drawing>
+      </w:r>
+    </w:p>
+    <w:p>
+      <w:pPr>
+        <w:pStyle w:val="Overskrift2"/>
+      </w:pPr>
+      <w:bookmarkStart w:id="59" w:name="_Toc222403499"/>
+      <w:r>
+        <w:lastRenderedPageBreak/>
         <w:t>Begrebsafklaring</w:t>
       </w:r>
-      <w:bookmarkEnd w:id="71"/>
+      <w:bookmarkEnd w:id="59"/>
     </w:p>
     <w:p>
       <w:pPr>
         <w:pStyle w:val="Overskrift2"/>
       </w:pPr>
-      <w:bookmarkStart w:id="72" w:name="_Toc222403500"/>
+      <w:bookmarkStart w:id="60" w:name="_Toc222403500"/>
       <w:r>
         <w:t>Analyseovervejelser</w:t>
       </w:r>
-      <w:bookmarkEnd w:id="72"/>
+      <w:bookmarkEnd w:id="60"/>
     </w:p>
     <w:p>
       <w:r>
@@ -18048,17 +18285,17 @@
       <w:pPr>
         <w:pStyle w:val="Overskrift1"/>
       </w:pPr>
-      <w:bookmarkStart w:id="73" w:name="_Toc222403501"/>
+      <w:bookmarkStart w:id="61" w:name="_Toc222403501"/>
       <w:r>
         <w:t>Systemsekvens og Interaktionsanalyse</w:t>
       </w:r>
-      <w:bookmarkEnd w:id="73"/>
+      <w:bookmarkEnd w:id="61"/>
     </w:p>
     <w:p>
       <w:pPr>
         <w:pStyle w:val="Overskrift2"/>
       </w:pPr>
-      <w:bookmarkStart w:id="74" w:name="_Toc222403502"/>
+      <w:bookmarkStart w:id="62" w:name="_Toc222403502"/>
       <w:r>
         <w:t xml:space="preserve">System </w:t>
       </w:r>
@@ -18070,13 +18307,13 @@
       <w:r>
         <w:t xml:space="preserve"> Diagram – Medicin</w:t>
       </w:r>
-      <w:bookmarkEnd w:id="74"/>
+      <w:bookmarkEnd w:id="62"/>
     </w:p>
     <w:p>
       <w:pPr>
         <w:pStyle w:val="Overskrift2"/>
       </w:pPr>
-      <w:bookmarkStart w:id="75" w:name="_Toc222403503"/>
+      <w:bookmarkStart w:id="63" w:name="_Toc222403503"/>
       <w:r>
         <w:t xml:space="preserve">System </w:t>
       </w:r>
@@ -18088,17 +18325,17 @@
       <w:r>
         <w:t xml:space="preserve"> Diagram – Vagtskifte</w:t>
       </w:r>
-      <w:bookmarkEnd w:id="75"/>
+      <w:bookmarkEnd w:id="63"/>
     </w:p>
     <w:p>
       <w:pPr>
         <w:pStyle w:val="Overskrift2"/>
       </w:pPr>
-      <w:bookmarkStart w:id="76" w:name="_Toc222403504"/>
+      <w:bookmarkStart w:id="64" w:name="_Toc222403504"/>
       <w:r>
         <w:t>Analyse af systemgrænse</w:t>
       </w:r>
-      <w:bookmarkEnd w:id="76"/>
+      <w:bookmarkEnd w:id="64"/>
     </w:p>
     <w:p>
       <w:r>
@@ -18115,24 +18352,24 @@
           <w:bCs/>
         </w:rPr>
       </w:pPr>
-      <w:bookmarkStart w:id="77" w:name="_Toc222403505"/>
+      <w:bookmarkStart w:id="65" w:name="_Toc222403505"/>
       <w:r>
         <w:rPr>
           <w:rStyle w:val="Overskrift1Tegn"/>
         </w:rPr>
         <w:t>Design og Arkitektur</w:t>
       </w:r>
-      <w:bookmarkEnd w:id="77"/>
+      <w:bookmarkEnd w:id="65"/>
     </w:p>
     <w:p>
       <w:pPr>
         <w:pStyle w:val="Overskrift2"/>
       </w:pPr>
-      <w:bookmarkStart w:id="78" w:name="_Toc222403506"/>
+      <w:bookmarkStart w:id="66" w:name="_Toc222403506"/>
       <w:r>
         <w:t>Overordnet arkitektur</w:t>
       </w:r>
-      <w:bookmarkEnd w:id="78"/>
+      <w:bookmarkEnd w:id="66"/>
     </w:p>
     <w:p>
       <w:r>
@@ -18149,65 +18386,62 @@
       </w:r>
       <w:proofErr w:type="spellEnd"/>
       <w:r>
-        <w:t xml:space="preserve">, hvor </w:t>
-      </w:r>
+        <w:t xml:space="preserve">, hvor forretningslogik og datahåndtering placeres. Shared-projektet indeholder fælles kontrakter, domænemodeller og </w:t>
+      </w:r>
+      <w:proofErr w:type="spellStart"/>
+      <w:r>
+        <w:t>DTO’er</w:t>
+      </w:r>
+      <w:proofErr w:type="spellEnd"/>
+      <w:r>
+        <w:t>, som deles mellem klient og server.</w:t>
+      </w:r>
+    </w:p>
+    <w:p>
+      <w:r>
+        <w:t xml:space="preserve">Arkitekturen understøtter separation of </w:t>
+      </w:r>
+      <w:proofErr w:type="spellStart"/>
+      <w:r>
+        <w:t>concerns</w:t>
+      </w:r>
+      <w:proofErr w:type="spellEnd"/>
+      <w:r>
+        <w:t xml:space="preserve"> og reducerer koblingen mellem lagene. Præsentationslaget afhænger af </w:t>
+      </w:r>
+      <w:proofErr w:type="spellStart"/>
+      <w:r>
+        <w:t>abstractions</w:t>
+      </w:r>
+      <w:proofErr w:type="spellEnd"/>
+      <w:r>
+        <w:t xml:space="preserve"> (interfaces) fremfor konkrete implementeringer, hvilket gør systemet mere fleksibelt og testbart.</w:t>
+      </w:r>
+    </w:p>
+    <w:p>
+      <w:r>
+        <w:t>Strukturen forbereder systemet til fremtidig udvidelse, herunder mulig web-</w:t>
+      </w:r>
+      <w:proofErr w:type="spellStart"/>
+      <w:r>
+        <w:t>deployment</w:t>
+      </w:r>
+      <w:proofErr w:type="spellEnd"/>
+      <w:r>
+        <w:t xml:space="preserve"> eller integration med eksterne systemer.</w:t>
+      </w:r>
+    </w:p>
+    <w:p/>
+    <w:p>
+      <w:pPr>
+        <w:pStyle w:val="Overskrift2"/>
+      </w:pPr>
+      <w:bookmarkStart w:id="67" w:name="_Toc222403507"/>
       <w:r>
         <w:lastRenderedPageBreak/>
-        <w:t xml:space="preserve">forretningslogik og datahåndtering placeres. Shared-projektet indeholder fælles kontrakter, domænemodeller og </w:t>
-      </w:r>
-      <w:proofErr w:type="spellStart"/>
-      <w:r>
-        <w:t>DTO’er</w:t>
-      </w:r>
-      <w:proofErr w:type="spellEnd"/>
-      <w:r>
-        <w:t>, som deles mellem klient og server.</w:t>
-      </w:r>
-    </w:p>
-    <w:p>
-      <w:r>
-        <w:t xml:space="preserve">Arkitekturen understøtter separation of </w:t>
-      </w:r>
-      <w:proofErr w:type="spellStart"/>
-      <w:r>
-        <w:t>concerns</w:t>
-      </w:r>
-      <w:proofErr w:type="spellEnd"/>
-      <w:r>
-        <w:t xml:space="preserve"> og reducerer koblingen mellem lagene. Præsentationslaget afhænger af </w:t>
-      </w:r>
-      <w:proofErr w:type="spellStart"/>
-      <w:r>
-        <w:t>abstractions</w:t>
-      </w:r>
-      <w:proofErr w:type="spellEnd"/>
-      <w:r>
-        <w:t xml:space="preserve"> (interfaces) fremfor konkrete implementeringer, hvilket gør systemet mere fleksibelt og testbart.</w:t>
-      </w:r>
-    </w:p>
-    <w:p>
-      <w:r>
-        <w:t>Strukturen forbereder systemet til fremtidig udvidelse, herunder mulig web-</w:t>
-      </w:r>
-      <w:proofErr w:type="spellStart"/>
-      <w:r>
-        <w:t>deployment</w:t>
-      </w:r>
-      <w:proofErr w:type="spellEnd"/>
-      <w:r>
-        <w:t xml:space="preserve"> eller integration med eksterne systemer.</w:t>
-      </w:r>
-    </w:p>
-    <w:p/>
-    <w:p>
-      <w:pPr>
-        <w:pStyle w:val="Overskrift2"/>
-      </w:pPr>
-      <w:bookmarkStart w:id="79" w:name="_Toc222403507"/>
-      <w:r>
         <w:t>Valg af teknologi (.NET MAUI Blazor Hybrid)</w:t>
       </w:r>
-      <w:bookmarkEnd w:id="79"/>
+      <w:bookmarkEnd w:id="67"/>
     </w:p>
     <w:p>
       <w:pPr>
@@ -18216,7 +18450,7 @@
           <w:lang w:val="en-US"/>
         </w:rPr>
       </w:pPr>
-      <w:bookmarkStart w:id="80" w:name="_Toc222403508"/>
+      <w:bookmarkStart w:id="68" w:name="_Toc222403508"/>
       <w:r>
         <w:rPr>
           <w:lang w:val="en-US"/>
@@ -18230,7 +18464,7 @@
         </w:rPr>
         <w:t>struktur</w:t>
       </w:r>
-      <w:bookmarkEnd w:id="80"/>
+      <w:bookmarkEnd w:id="68"/>
       <w:proofErr w:type="spellEnd"/>
     </w:p>
     <w:p>
@@ -18240,14 +18474,14 @@
           <w:lang w:val="en-US"/>
         </w:rPr>
       </w:pPr>
-      <w:bookmarkStart w:id="81" w:name="_Toc222403509"/>
+      <w:bookmarkStart w:id="69" w:name="_Toc222403509"/>
       <w:r>
         <w:rPr>
           <w:lang w:val="en-US"/>
         </w:rPr>
         <w:t>Dependency Injection</w:t>
       </w:r>
-      <w:bookmarkEnd w:id="81"/>
+      <w:bookmarkEnd w:id="69"/>
     </w:p>
     <w:p>
       <w:proofErr w:type="spellStart"/>
@@ -18349,14 +18583,14 @@
           <w:lang w:val="en-US"/>
         </w:rPr>
       </w:pPr>
-      <w:bookmarkStart w:id="82" w:name="_Toc222403510"/>
+      <w:bookmarkStart w:id="70" w:name="_Toc222403510"/>
       <w:r>
         <w:rPr>
           <w:lang w:val="en-US"/>
         </w:rPr>
         <w:t>SOLID, GRASP, KISS, DRY</w:t>
       </w:r>
-      <w:bookmarkEnd w:id="82"/>
+      <w:bookmarkEnd w:id="70"/>
     </w:p>
     <w:p>
       <w:r>
@@ -18372,16 +18606,15 @@
           <w:lang w:val="en-US"/>
         </w:rPr>
       </w:pPr>
-      <w:bookmarkStart w:id="83" w:name="_Toc222403511"/>
+      <w:bookmarkStart w:id="71" w:name="_Toc222403511"/>
       <w:proofErr w:type="spellStart"/>
       <w:r>
         <w:rPr>
           <w:lang w:val="en-US"/>
         </w:rPr>
-        <w:lastRenderedPageBreak/>
         <w:t>Designmodeller</w:t>
       </w:r>
-      <w:bookmarkEnd w:id="83"/>
+      <w:bookmarkEnd w:id="71"/>
       <w:proofErr w:type="spellEnd"/>
     </w:p>
     <w:p>
@@ -18391,7 +18624,7 @@
           <w:lang w:val="en-US"/>
         </w:rPr>
       </w:pPr>
-      <w:bookmarkStart w:id="84" w:name="_Toc222403512"/>
+      <w:bookmarkStart w:id="72" w:name="_Toc222403512"/>
       <w:r>
         <w:rPr>
           <w:lang w:val="en-US"/>
@@ -18404,45 +18637,316 @@
         </w:rPr>
         <w:t>esign Class Diagram (DCD)</w:t>
       </w:r>
-      <w:bookmarkEnd w:id="84"/>
+      <w:bookmarkEnd w:id="72"/>
+    </w:p>
+    <w:p>
+      <w:r>
+        <w:t xml:space="preserve">Design </w:t>
+      </w:r>
+      <w:proofErr w:type="gramStart"/>
+      <w:r>
+        <w:t>class diagrammet</w:t>
+      </w:r>
+      <w:proofErr w:type="gramEnd"/>
+      <w:r>
+        <w:t xml:space="preserve"> </w:t>
+      </w:r>
+      <w:r>
+        <w:t xml:space="preserve">anvendes til at beskrive systemets konkrete softwaredesign på klasseniveau. Diagrammet viser klasser, deres ansvar, relationer og afhængigheder. For UC01 illustrerer </w:t>
+      </w:r>
+      <w:proofErr w:type="spellStart"/>
+      <w:r>
+        <w:t>DCD’en</w:t>
+      </w:r>
+      <w:proofErr w:type="spellEnd"/>
+      <w:r>
+        <w:t xml:space="preserve"> opbygningen efter MVC-princippet samt brugen af interfaces og </w:t>
+      </w:r>
+      <w:proofErr w:type="spellStart"/>
+      <w:r>
+        <w:t>Dependency</w:t>
+      </w:r>
+      <w:proofErr w:type="spellEnd"/>
+      <w:r>
+        <w:t xml:space="preserve"> </w:t>
+      </w:r>
+      <w:proofErr w:type="spellStart"/>
+      <w:r>
+        <w:t>Injection</w:t>
+      </w:r>
+      <w:proofErr w:type="spellEnd"/>
+      <w:r>
+        <w:t xml:space="preserve"> for at reducere kobling. </w:t>
+      </w:r>
+      <w:proofErr w:type="spellStart"/>
+      <w:r>
+        <w:t>DCD’en</w:t>
+      </w:r>
+      <w:proofErr w:type="spellEnd"/>
+      <w:r>
+        <w:t xml:space="preserve"> danner grundlag for implementeringen og sikrer sporbarhed fra analyse til kode.</w:t>
+      </w:r>
+    </w:p>
+    <w:p>
+      <w:pPr>
+        <w:rPr>
+          <w:lang w:val="en-US"/>
+        </w:rPr>
+      </w:pPr>
+      <w:r>
+        <w:rPr>
+          <w:noProof/>
+          <w:lang w:val="en-US"/>
+        </w:rPr>
+        <w:lastRenderedPageBreak/>
+        <w:drawing>
+          <wp:inline distT="0" distB="0" distL="0" distR="0" wp14:anchorId="4F29687D" wp14:editId="3FFCA2E6">
+            <wp:extent cx="6120130" cy="2348179"/>
+            <wp:effectExtent l="0" t="0" r="0" b="0"/>
+            <wp:docPr id="1913021651" name="Grafik 10"/>
+            <wp:cNvGraphicFramePr>
+              <a:graphicFrameLocks xmlns:a="http://schemas.openxmlformats.org/drawingml/2006/main" noChangeAspect="1"/>
+            </wp:cNvGraphicFramePr>
+            <a:graphic xmlns:a="http://schemas.openxmlformats.org/drawingml/2006/main">
+              <a:graphicData uri="http://schemas.openxmlformats.org/drawingml/2006/picture">
+                <pic:pic xmlns:pic="http://schemas.openxmlformats.org/drawingml/2006/picture">
+                  <pic:nvPicPr>
+                    <pic:cNvPr id="1913021651" name="Grafik 1913021651"/>
+                    <pic:cNvPicPr/>
+                  </pic:nvPicPr>
+                  <pic:blipFill>
+                    <a:blip r:embed="rId12">
+                      <a:extLst>
+                        <a:ext uri="{96DAC541-7B7A-43D3-8B79-37D633B846F1}">
+                          <asvg:svgBlip xmlns:asvg="http://schemas.microsoft.com/office/drawing/2016/SVG/main" r:embed="rId13"/>
+                        </a:ext>
+                      </a:extLst>
+                    </a:blip>
+                    <a:stretch>
+                      <a:fillRect/>
+                    </a:stretch>
+                  </pic:blipFill>
+                  <pic:spPr>
+                    <a:xfrm>
+                      <a:off x="0" y="0"/>
+                      <a:ext cx="6131392" cy="2352500"/>
+                    </a:xfrm>
+                    <a:prstGeom prst="rect">
+                      <a:avLst/>
+                    </a:prstGeom>
+                  </pic:spPr>
+                </pic:pic>
+              </a:graphicData>
+            </a:graphic>
+          </wp:inline>
+        </w:drawing>
+      </w:r>
     </w:p>
     <w:p>
       <w:pPr>
         <w:pStyle w:val="Overskrift2"/>
       </w:pPr>
-      <w:bookmarkStart w:id="85" w:name="_Toc222403513"/>
-      <w:r>
-        <w:t>Sekvensdiagram – Vagtskifte (design-</w:t>
+      <w:bookmarkStart w:id="73" w:name="_Toc222403513"/>
+      <w:r>
+        <w:t>SSD</w:t>
+      </w:r>
+      <w:r>
+        <w:t xml:space="preserve"> – </w:t>
+      </w:r>
+      <w:bookmarkEnd w:id="73"/>
+      <w:r>
+        <w:t>UC01 – Login</w:t>
+      </w:r>
+    </w:p>
+    <w:p>
+      <w:r>
+        <w:rPr>
+          <w:rStyle w:val="Strk"/>
+          <w:b w:val="0"/>
+          <w:bCs w:val="0"/>
+        </w:rPr>
+        <w:t xml:space="preserve">System </w:t>
       </w:r>
       <w:proofErr w:type="spellStart"/>
       <w:r>
-        <w:t>level</w:t>
+        <w:rPr>
+          <w:rStyle w:val="Strk"/>
+          <w:b w:val="0"/>
+          <w:bCs w:val="0"/>
+        </w:rPr>
+        <w:t>Sequence</w:t>
       </w:r>
       <w:proofErr w:type="spellEnd"/>
       <w:r>
-        <w:t>)</w:t>
-      </w:r>
-      <w:bookmarkEnd w:id="85"/>
+        <w:rPr>
+          <w:rStyle w:val="Strk"/>
+          <w:b w:val="0"/>
+          <w:bCs w:val="0"/>
+        </w:rPr>
+        <w:t xml:space="preserve"> Diagram</w:t>
+      </w:r>
+      <w:r>
+        <w:rPr>
+          <w:rStyle w:val="Strk"/>
+          <w:b w:val="0"/>
+          <w:bCs w:val="0"/>
+        </w:rPr>
+        <w:t>met</w:t>
+      </w:r>
+      <w:r>
+        <w:t xml:space="preserve"> beskriver interaktionen mellem aktøren og systemet. For UC01 viser </w:t>
+      </w:r>
+      <w:proofErr w:type="spellStart"/>
+      <w:r>
+        <w:t>SSD’en</w:t>
+      </w:r>
+      <w:proofErr w:type="spellEnd"/>
+      <w:r>
+        <w:t xml:space="preserve"> de systemkald, der udføres ved login, samt systemets respons ved succes, ugyldige </w:t>
+      </w:r>
+      <w:proofErr w:type="spellStart"/>
+      <w:r>
+        <w:t>credentials</w:t>
+      </w:r>
+      <w:proofErr w:type="spellEnd"/>
+      <w:r>
+        <w:t xml:space="preserve"> og manglende rolle. Diagrammet tydeliggør systemets ansvar og grænseflade. </w:t>
+      </w:r>
+      <w:proofErr w:type="spellStart"/>
+      <w:r>
+        <w:t>SSD’en</w:t>
+      </w:r>
+      <w:proofErr w:type="spellEnd"/>
+      <w:r>
+        <w:t xml:space="preserve"> danner grundlag for det efterfølgende sekvensdiagram.</w:t>
+      </w:r>
+    </w:p>
+    <w:p/>
+    <w:p>
+      <w:r>
+        <w:rPr>
+          <w:noProof/>
+        </w:rPr>
+        <w:drawing>
+          <wp:inline distT="0" distB="0" distL="0" distR="0" wp14:anchorId="676EBB73" wp14:editId="0235EAD4">
+            <wp:extent cx="1799539" cy="2965211"/>
+            <wp:effectExtent l="0" t="0" r="0" b="6985"/>
+            <wp:docPr id="762382426" name="Grafik 3"/>
+            <wp:cNvGraphicFramePr>
+              <a:graphicFrameLocks xmlns:a="http://schemas.openxmlformats.org/drawingml/2006/main" noChangeAspect="1"/>
+            </wp:cNvGraphicFramePr>
+            <a:graphic xmlns:a="http://schemas.openxmlformats.org/drawingml/2006/main">
+              <a:graphicData uri="http://schemas.openxmlformats.org/drawingml/2006/picture">
+                <pic:pic xmlns:pic="http://schemas.openxmlformats.org/drawingml/2006/picture">
+                  <pic:nvPicPr>
+                    <pic:cNvPr id="762382426" name="Grafik 762382426"/>
+                    <pic:cNvPicPr/>
+                  </pic:nvPicPr>
+                  <pic:blipFill>
+                    <a:blip r:embed="rId14">
+                      <a:extLst>
+                        <a:ext uri="{96DAC541-7B7A-43D3-8B79-37D633B846F1}">
+                          <asvg:svgBlip xmlns:asvg="http://schemas.microsoft.com/office/drawing/2016/SVG/main" r:embed="rId15"/>
+                        </a:ext>
+                      </a:extLst>
+                    </a:blip>
+                    <a:stretch>
+                      <a:fillRect/>
+                    </a:stretch>
+                  </pic:blipFill>
+                  <pic:spPr>
+                    <a:xfrm>
+                      <a:off x="0" y="0"/>
+                      <a:ext cx="1803035" cy="2970972"/>
+                    </a:xfrm>
+                    <a:prstGeom prst="rect">
+                      <a:avLst/>
+                    </a:prstGeom>
+                  </pic:spPr>
+                </pic:pic>
+              </a:graphicData>
+            </a:graphic>
+          </wp:inline>
+        </w:drawing>
+      </w:r>
     </w:p>
     <w:p>
       <w:pPr>
         <w:pStyle w:val="Overskrift2"/>
       </w:pPr>
-      <w:bookmarkStart w:id="86" w:name="_Toc222403514"/>
-      <w:r>
-        <w:t>Sekvensdiagram – Borgerstatus</w:t>
-      </w:r>
-      <w:bookmarkEnd w:id="86"/>
+      <w:bookmarkStart w:id="74" w:name="_Toc222403514"/>
+      <w:r>
+        <w:lastRenderedPageBreak/>
+        <w:t xml:space="preserve">Sekvensdiagram – </w:t>
+      </w:r>
+      <w:bookmarkEnd w:id="74"/>
+      <w:r>
+        <w:t xml:space="preserve">UC01 </w:t>
+      </w:r>
+      <w:r>
+        <w:t>–</w:t>
+      </w:r>
+      <w:r>
+        <w:t xml:space="preserve"> Login</w:t>
+      </w:r>
+    </w:p>
+    <w:p>
+      <w:r>
+        <w:rPr>
+          <w:noProof/>
+        </w:rPr>
+        <w:drawing>
+          <wp:inline distT="0" distB="0" distL="0" distR="0" wp14:anchorId="6870326E" wp14:editId="3D86D0F3">
+            <wp:extent cx="6120130" cy="6279515"/>
+            <wp:effectExtent l="0" t="0" r="0" b="6985"/>
+            <wp:docPr id="1289150498" name="Grafik 4"/>
+            <wp:cNvGraphicFramePr>
+              <a:graphicFrameLocks xmlns:a="http://schemas.openxmlformats.org/drawingml/2006/main" noChangeAspect="1"/>
+            </wp:cNvGraphicFramePr>
+            <a:graphic xmlns:a="http://schemas.openxmlformats.org/drawingml/2006/main">
+              <a:graphicData uri="http://schemas.openxmlformats.org/drawingml/2006/picture">
+                <pic:pic xmlns:pic="http://schemas.openxmlformats.org/drawingml/2006/picture">
+                  <pic:nvPicPr>
+                    <pic:cNvPr id="1289150498" name="Grafik 1289150498"/>
+                    <pic:cNvPicPr/>
+                  </pic:nvPicPr>
+                  <pic:blipFill>
+                    <a:blip r:embed="rId16">
+                      <a:extLst>
+                        <a:ext uri="{96DAC541-7B7A-43D3-8B79-37D633B846F1}">
+                          <asvg:svgBlip xmlns:asvg="http://schemas.microsoft.com/office/drawing/2016/SVG/main" r:embed="rId17"/>
+                        </a:ext>
+                      </a:extLst>
+                    </a:blip>
+                    <a:stretch>
+                      <a:fillRect/>
+                    </a:stretch>
+                  </pic:blipFill>
+                  <pic:spPr>
+                    <a:xfrm>
+                      <a:off x="0" y="0"/>
+                      <a:ext cx="6120130" cy="6279515"/>
+                    </a:xfrm>
+                    <a:prstGeom prst="rect">
+                      <a:avLst/>
+                    </a:prstGeom>
+                  </pic:spPr>
+                </pic:pic>
+              </a:graphicData>
+            </a:graphic>
+          </wp:inline>
+        </w:drawing>
+      </w:r>
     </w:p>
     <w:p>
       <w:pPr>
         <w:pStyle w:val="Overskrift2"/>
       </w:pPr>
-      <w:bookmarkStart w:id="87" w:name="_Toc222403515"/>
+      <w:bookmarkStart w:id="75" w:name="_Toc222403515"/>
       <w:r>
         <w:t>Ansvarsfordeling i klasser</w:t>
       </w:r>
-      <w:bookmarkEnd w:id="87"/>
+      <w:bookmarkEnd w:id="75"/>
     </w:p>
     <w:p>
       <w:r>
@@ -18456,43 +18960,44 @@
         <w:pStyle w:val="Overskrift1"/>
       </w:pPr>
       <w:r>
+        <w:lastRenderedPageBreak/>
         <w:t xml:space="preserve"> </w:t>
       </w:r>
-      <w:bookmarkStart w:id="88" w:name="_Toc222403516"/>
+      <w:bookmarkStart w:id="76" w:name="_Toc222403516"/>
       <w:r>
         <w:t>Datamodel</w:t>
       </w:r>
-      <w:bookmarkEnd w:id="88"/>
+      <w:bookmarkEnd w:id="76"/>
     </w:p>
     <w:p>
       <w:pPr>
         <w:pStyle w:val="Overskrift2"/>
       </w:pPr>
-      <w:bookmarkStart w:id="89" w:name="_Toc222403517"/>
+      <w:bookmarkStart w:id="77" w:name="_Toc222403517"/>
       <w:r>
         <w:t>ER-diagram</w:t>
       </w:r>
-      <w:bookmarkEnd w:id="89"/>
+      <w:bookmarkEnd w:id="77"/>
     </w:p>
     <w:p>
       <w:pPr>
         <w:pStyle w:val="Overskrift2"/>
       </w:pPr>
-      <w:bookmarkStart w:id="90" w:name="_Toc222403518"/>
+      <w:bookmarkStart w:id="78" w:name="_Toc222403518"/>
       <w:r>
         <w:t>Entiteter og relationer</w:t>
       </w:r>
-      <w:bookmarkEnd w:id="90"/>
+      <w:bookmarkEnd w:id="78"/>
     </w:p>
     <w:p>
       <w:pPr>
         <w:pStyle w:val="Overskrift2"/>
       </w:pPr>
-      <w:bookmarkStart w:id="91" w:name="_Toc222403519"/>
+      <w:bookmarkStart w:id="79" w:name="_Toc222403519"/>
       <w:r>
         <w:t>Historik- og audit-strategi</w:t>
       </w:r>
-      <w:bookmarkEnd w:id="91"/>
+      <w:bookmarkEnd w:id="79"/>
     </w:p>
     <w:p>
       <w:r>
@@ -18539,10 +19044,9 @@
         </w:rPr>
       </w:pPr>
       <w:r>
-        <w:lastRenderedPageBreak/>
         <w:t xml:space="preserve"> </w:t>
       </w:r>
-      <w:bookmarkStart w:id="92" w:name="_Toc222403520"/>
+      <w:bookmarkStart w:id="80" w:name="_Toc222403520"/>
       <w:proofErr w:type="spellStart"/>
       <w:r>
         <w:rPr>
@@ -18550,7 +19054,7 @@
         </w:rPr>
         <w:t>Brugergrænseflade</w:t>
       </w:r>
-      <w:bookmarkEnd w:id="92"/>
+      <w:bookmarkEnd w:id="80"/>
       <w:proofErr w:type="spellEnd"/>
     </w:p>
     <w:p>
@@ -18566,7 +19070,7 @@
         </w:rPr>
         <w:t xml:space="preserve"> </w:t>
       </w:r>
-      <w:bookmarkStart w:id="93" w:name="_Toc222403521"/>
+      <w:bookmarkStart w:id="81" w:name="_Toc222403521"/>
       <w:proofErr w:type="spellStart"/>
       <w:r>
         <w:rPr>
@@ -18574,7 +19078,7 @@
         </w:rPr>
         <w:t>Designprincipper</w:t>
       </w:r>
-      <w:bookmarkEnd w:id="93"/>
+      <w:bookmarkEnd w:id="81"/>
       <w:proofErr w:type="spellEnd"/>
     </w:p>
     <w:p>
@@ -18584,14 +19088,14 @@
           <w:lang w:val="en-US"/>
         </w:rPr>
       </w:pPr>
-      <w:bookmarkStart w:id="94" w:name="_Toc222403522"/>
+      <w:bookmarkStart w:id="82" w:name="_Toc222403522"/>
       <w:r>
         <w:rPr>
           <w:lang w:val="en-US"/>
         </w:rPr>
         <w:t>Wireframe – Public View</w:t>
       </w:r>
-      <w:bookmarkEnd w:id="94"/>
+      <w:bookmarkEnd w:id="82"/>
     </w:p>
     <w:p>
       <w:pPr>
@@ -18600,14 +19104,14 @@
           <w:lang w:val="en-US"/>
         </w:rPr>
       </w:pPr>
-      <w:bookmarkStart w:id="95" w:name="_Toc222403523"/>
+      <w:bookmarkStart w:id="83" w:name="_Toc222403523"/>
       <w:r>
         <w:rPr>
           <w:lang w:val="en-US"/>
         </w:rPr>
         <w:t>Wireframe – Login</w:t>
       </w:r>
-      <w:bookmarkEnd w:id="95"/>
+      <w:bookmarkEnd w:id="83"/>
     </w:p>
     <w:p>
       <w:pPr>
@@ -18616,24 +19120,24 @@
           <w:lang w:val="en-US"/>
         </w:rPr>
       </w:pPr>
-      <w:bookmarkStart w:id="96" w:name="_Toc222403524"/>
+      <w:bookmarkStart w:id="84" w:name="_Toc222403524"/>
       <w:r>
         <w:rPr>
           <w:lang w:val="en-US"/>
         </w:rPr>
         <w:t>Wireframe – Overlap screen</w:t>
       </w:r>
-      <w:bookmarkEnd w:id="96"/>
+      <w:bookmarkEnd w:id="84"/>
     </w:p>
     <w:p>
       <w:pPr>
         <w:pStyle w:val="Overskrift2"/>
       </w:pPr>
-      <w:bookmarkStart w:id="97" w:name="_Toc222403525"/>
+      <w:bookmarkStart w:id="85" w:name="_Toc222403525"/>
       <w:r>
         <w:t>Brugervenlighed for IT-ukyndige</w:t>
       </w:r>
-      <w:bookmarkEnd w:id="97"/>
+      <w:bookmarkEnd w:id="85"/>
     </w:p>
     <w:p>
       <w:r>
@@ -18647,43 +19151,44 @@
         <w:pStyle w:val="Overskrift1"/>
       </w:pPr>
       <w:r>
+        <w:lastRenderedPageBreak/>
         <w:t xml:space="preserve"> </w:t>
       </w:r>
-      <w:bookmarkStart w:id="98" w:name="_Toc222403526"/>
+      <w:bookmarkStart w:id="86" w:name="_Toc222403526"/>
       <w:r>
         <w:t>Medicinhåndtering</w:t>
       </w:r>
-      <w:bookmarkEnd w:id="98"/>
+      <w:bookmarkEnd w:id="86"/>
     </w:p>
     <w:p>
       <w:pPr>
         <w:pStyle w:val="Overskrift2"/>
       </w:pPr>
-      <w:bookmarkStart w:id="99" w:name="_Toc222403527"/>
+      <w:bookmarkStart w:id="87" w:name="_Toc222403527"/>
       <w:r>
         <w:t>Aktivitetsdiagram – Fast medicin</w:t>
       </w:r>
-      <w:bookmarkEnd w:id="99"/>
+      <w:bookmarkEnd w:id="87"/>
     </w:p>
     <w:p>
       <w:pPr>
         <w:pStyle w:val="Overskrift2"/>
       </w:pPr>
-      <w:bookmarkStart w:id="100" w:name="_Toc222403528"/>
+      <w:bookmarkStart w:id="88" w:name="_Toc222403528"/>
       <w:r>
         <w:t>PN medicin-flow</w:t>
       </w:r>
-      <w:bookmarkEnd w:id="100"/>
+      <w:bookmarkEnd w:id="88"/>
     </w:p>
     <w:p>
       <w:pPr>
         <w:pStyle w:val="Overskrift2"/>
       </w:pPr>
-      <w:bookmarkStart w:id="101" w:name="_Toc222403529"/>
+      <w:bookmarkStart w:id="89" w:name="_Toc222403529"/>
       <w:r>
         <w:t>Validering og logning</w:t>
       </w:r>
-      <w:bookmarkEnd w:id="101"/>
+      <w:bookmarkEnd w:id="89"/>
     </w:p>
     <w:p>
       <w:r>
@@ -18699,7 +19204,7 @@
       <w:r>
         <w:t xml:space="preserve"> </w:t>
       </w:r>
-      <w:bookmarkStart w:id="102" w:name="_Toc222403530"/>
+      <w:bookmarkStart w:id="90" w:name="_Toc222403530"/>
       <w:r>
         <w:t>Ikke-funktionelle Krav (</w:t>
       </w:r>
@@ -18719,58 +19224,58 @@
       <w:r>
         <w:t>)</w:t>
       </w:r>
-      <w:bookmarkEnd w:id="102"/>
+      <w:bookmarkEnd w:id="90"/>
     </w:p>
     <w:p>
       <w:pPr>
         <w:pStyle w:val="Overskrift2"/>
       </w:pPr>
-      <w:bookmarkStart w:id="103" w:name="_Toc222403531"/>
+      <w:bookmarkStart w:id="91" w:name="_Toc222403531"/>
       <w:r>
         <w:t>Brugervenlighed</w:t>
       </w:r>
-      <w:bookmarkEnd w:id="103"/>
+      <w:bookmarkEnd w:id="91"/>
     </w:p>
     <w:p>
       <w:pPr>
         <w:pStyle w:val="Overskrift2"/>
       </w:pPr>
-      <w:bookmarkStart w:id="104" w:name="_Toc222403532"/>
+      <w:bookmarkStart w:id="92" w:name="_Toc222403532"/>
       <w:r>
         <w:t>Sikkerhed</w:t>
       </w:r>
-      <w:bookmarkEnd w:id="104"/>
+      <w:bookmarkEnd w:id="92"/>
     </w:p>
     <w:p>
       <w:pPr>
         <w:pStyle w:val="Overskrift2"/>
       </w:pPr>
-      <w:bookmarkStart w:id="105" w:name="_Toc222403533"/>
+      <w:bookmarkStart w:id="93" w:name="_Toc222403533"/>
       <w:r>
         <w:t>Performance</w:t>
       </w:r>
-      <w:bookmarkEnd w:id="105"/>
+      <w:bookmarkEnd w:id="93"/>
     </w:p>
     <w:p>
       <w:pPr>
         <w:pStyle w:val="Overskrift2"/>
       </w:pPr>
-      <w:bookmarkStart w:id="106" w:name="_Toc222403534"/>
+      <w:bookmarkStart w:id="94" w:name="_Toc222403534"/>
       <w:r>
         <w:t>Tilgængelighed</w:t>
       </w:r>
-      <w:bookmarkEnd w:id="106"/>
+      <w:bookmarkEnd w:id="94"/>
     </w:p>
     <w:p>
       <w:pPr>
         <w:pStyle w:val="Overskrift2"/>
       </w:pPr>
-      <w:bookmarkStart w:id="107" w:name="_Toc222403535"/>
+      <w:bookmarkStart w:id="95" w:name="_Toc222403535"/>
       <w:proofErr w:type="spellStart"/>
       <w:r>
         <w:t>Vedligeholdbarhed</w:t>
       </w:r>
-      <w:bookmarkEnd w:id="107"/>
+      <w:bookmarkEnd w:id="95"/>
       <w:proofErr w:type="spellEnd"/>
     </w:p>
     <w:p>
@@ -18785,74 +19290,73 @@
         <w:pStyle w:val="Overskrift1"/>
       </w:pPr>
       <w:r>
-        <w:lastRenderedPageBreak/>
         <w:t xml:space="preserve"> </w:t>
       </w:r>
-      <w:bookmarkStart w:id="108" w:name="_Toc222403536"/>
+      <w:bookmarkStart w:id="96" w:name="_Toc222403536"/>
       <w:r>
         <w:t>Risikovurdering og GDPR</w:t>
       </w:r>
-      <w:bookmarkEnd w:id="108"/>
+      <w:bookmarkEnd w:id="96"/>
     </w:p>
     <w:p>
       <w:pPr>
         <w:pStyle w:val="Overskrift2"/>
       </w:pPr>
-      <w:bookmarkStart w:id="109" w:name="_Toc222403537"/>
+      <w:bookmarkStart w:id="97" w:name="_Toc222403537"/>
       <w:r>
         <w:t>GDPR-kontekst</w:t>
       </w:r>
-      <w:bookmarkEnd w:id="109"/>
+      <w:bookmarkEnd w:id="97"/>
     </w:p>
     <w:p>
       <w:pPr>
         <w:pStyle w:val="Overskrift2"/>
       </w:pPr>
-      <w:bookmarkStart w:id="110" w:name="_Toc222403538"/>
+      <w:bookmarkStart w:id="98" w:name="_Toc222403538"/>
       <w:r>
         <w:t>Risikotabel</w:t>
       </w:r>
-      <w:bookmarkEnd w:id="110"/>
+      <w:bookmarkEnd w:id="98"/>
     </w:p>
     <w:p>
       <w:pPr>
         <w:pStyle w:val="Overskrift2"/>
       </w:pPr>
-      <w:bookmarkStart w:id="111" w:name="_Toc222403539"/>
+      <w:bookmarkStart w:id="99" w:name="_Toc222403539"/>
       <w:r>
         <w:t>Anonymisering vs. lukket system</w:t>
       </w:r>
-      <w:bookmarkEnd w:id="111"/>
+      <w:bookmarkEnd w:id="99"/>
     </w:p>
     <w:p>
       <w:pPr>
         <w:pStyle w:val="Overskrift2"/>
       </w:pPr>
-      <w:bookmarkStart w:id="112" w:name="_Toc222403540"/>
+      <w:bookmarkStart w:id="100" w:name="_Toc222403540"/>
       <w:r>
         <w:t>Rollebaseret adgang</w:t>
       </w:r>
-      <w:bookmarkEnd w:id="112"/>
+      <w:bookmarkEnd w:id="100"/>
     </w:p>
     <w:p>
       <w:pPr>
         <w:pStyle w:val="Overskrift2"/>
       </w:pPr>
-      <w:bookmarkStart w:id="113" w:name="_Toc222403541"/>
+      <w:bookmarkStart w:id="101" w:name="_Toc222403541"/>
       <w:r>
         <w:t>Audit-log og sporbarhed</w:t>
       </w:r>
-      <w:bookmarkEnd w:id="113"/>
+      <w:bookmarkEnd w:id="101"/>
     </w:p>
     <w:p>
       <w:pPr>
         <w:pStyle w:val="Overskrift2"/>
       </w:pPr>
-      <w:bookmarkStart w:id="114" w:name="_Toc222403542"/>
+      <w:bookmarkStart w:id="102" w:name="_Toc222403542"/>
       <w:r>
         <w:t>Argumentation for løsning</w:t>
       </w:r>
-      <w:bookmarkEnd w:id="114"/>
+      <w:bookmarkEnd w:id="102"/>
     </w:p>
     <w:p>
       <w:r>
@@ -18866,13 +19370,14 @@
         <w:pStyle w:val="Overskrift1"/>
       </w:pPr>
       <w:r>
+        <w:lastRenderedPageBreak/>
         <w:t xml:space="preserve"> </w:t>
       </w:r>
-      <w:bookmarkStart w:id="115" w:name="_Toc222403543"/>
+      <w:bookmarkStart w:id="103" w:name="_Toc222403543"/>
       <w:r>
         <w:t>Deployment og Infrastruktur</w:t>
       </w:r>
-      <w:bookmarkEnd w:id="115"/>
+      <w:bookmarkEnd w:id="103"/>
     </w:p>
     <w:p>
       <w:r>
@@ -18902,41 +19407,41 @@
       <w:pPr>
         <w:pStyle w:val="Overskrift2"/>
       </w:pPr>
-      <w:bookmarkStart w:id="116" w:name="_Toc222403544"/>
+      <w:bookmarkStart w:id="104" w:name="_Toc222403544"/>
       <w:r>
         <w:t>Deployment diagram</w:t>
       </w:r>
-      <w:bookmarkEnd w:id="116"/>
+      <w:bookmarkEnd w:id="104"/>
     </w:p>
     <w:p>
       <w:pPr>
         <w:pStyle w:val="Overskrift2"/>
       </w:pPr>
-      <w:bookmarkStart w:id="117" w:name="_Toc222403545"/>
+      <w:bookmarkStart w:id="105" w:name="_Toc222403545"/>
       <w:r>
         <w:t>Lukket installationsscenarie</w:t>
       </w:r>
-      <w:bookmarkEnd w:id="117"/>
+      <w:bookmarkEnd w:id="105"/>
     </w:p>
     <w:p>
       <w:pPr>
         <w:pStyle w:val="Overskrift2"/>
       </w:pPr>
-      <w:bookmarkStart w:id="118" w:name="_Toc222403546"/>
+      <w:bookmarkStart w:id="106" w:name="_Toc222403546"/>
       <w:r>
         <w:t>Ekstern anonym adgang</w:t>
       </w:r>
-      <w:bookmarkEnd w:id="118"/>
+      <w:bookmarkEnd w:id="106"/>
     </w:p>
     <w:p>
       <w:pPr>
         <w:pStyle w:val="Overskrift2"/>
       </w:pPr>
-      <w:bookmarkStart w:id="119" w:name="_Toc222403547"/>
+      <w:bookmarkStart w:id="107" w:name="_Toc222403547"/>
       <w:r>
         <w:t>Driftsovervejelser</w:t>
       </w:r>
-      <w:bookmarkEnd w:id="119"/>
+      <w:bookmarkEnd w:id="107"/>
     </w:p>
     <w:p>
       <w:r>
@@ -18950,139 +19455,139 @@
         <w:pStyle w:val="Overskrift1"/>
       </w:pPr>
       <w:r>
+        <w:t xml:space="preserve"> </w:t>
+      </w:r>
+      <w:bookmarkStart w:id="108" w:name="_Toc222403548"/>
+      <w:r>
+        <w:t>Implementering</w:t>
+      </w:r>
+      <w:bookmarkEnd w:id="108"/>
+    </w:p>
+    <w:p>
+      <w:pPr>
+        <w:pStyle w:val="Overskrift2"/>
+      </w:pPr>
+      <w:bookmarkStart w:id="109" w:name="_Toc222403549"/>
+      <w:r>
+        <w:t>Projektstruktur</w:t>
+      </w:r>
+      <w:bookmarkEnd w:id="109"/>
+    </w:p>
+    <w:p>
+      <w:r>
+        <w:t>Løsningen er opdelt i flere projekter for at sikre klar ansvarsfordeling og lav kobling mellem komponenter.</w:t>
+      </w:r>
+    </w:p>
+    <w:p>
+      <w:r>
+        <w:t>VIGOR indeholder MAUI Blazor Hybrid-applikationen og håndterer brugergrænseflade og klientlogik.</w:t>
+      </w:r>
+      <w:r>
+        <w:br/>
+      </w:r>
+      <w:proofErr w:type="spellStart"/>
+      <w:r>
+        <w:t>VIGOR.Web</w:t>
+      </w:r>
+      <w:proofErr w:type="spellEnd"/>
+      <w:r>
+        <w:t xml:space="preserve"> indeholder serverlogik, API-</w:t>
+      </w:r>
+      <w:proofErr w:type="spellStart"/>
+      <w:r>
+        <w:t>endpoints</w:t>
+      </w:r>
+      <w:proofErr w:type="spellEnd"/>
+      <w:r>
+        <w:t xml:space="preserve"> og dataadgang.</w:t>
+      </w:r>
+      <w:r>
+        <w:br/>
+      </w:r>
+      <w:proofErr w:type="spellStart"/>
+      <w:r>
+        <w:t>VIGOR.Shared</w:t>
+      </w:r>
+      <w:proofErr w:type="spellEnd"/>
+      <w:r>
+        <w:t xml:space="preserve"> indeholder fælles kontrakter, domænemodeller og </w:t>
+      </w:r>
+      <w:proofErr w:type="spellStart"/>
+      <w:r>
+        <w:t>DTO’er</w:t>
+      </w:r>
+      <w:proofErr w:type="spellEnd"/>
+      <w:r>
+        <w:t>, som deles mellem klient og server.</w:t>
+      </w:r>
+    </w:p>
+    <w:p>
+      <w:r>
+        <w:t xml:space="preserve">Denne struktur understøtter lagdeling og separation of </w:t>
+      </w:r>
+      <w:proofErr w:type="spellStart"/>
+      <w:r>
+        <w:t>concerns</w:t>
+      </w:r>
+      <w:proofErr w:type="spellEnd"/>
+      <w:r>
+        <w:t xml:space="preserve"> og gør det muligt at udvikle og teste komponenter isoleret. Projektopdelingen bidrager til </w:t>
+      </w:r>
+      <w:proofErr w:type="spellStart"/>
+      <w:r>
+        <w:t>vedligeholdbarhed</w:t>
+      </w:r>
+      <w:proofErr w:type="spellEnd"/>
+      <w:r>
+        <w:t xml:space="preserve"> og giver fleksibilitet i forhold til fremtidige ændringer eller udvidelser.</w:t>
+      </w:r>
+    </w:p>
+    <w:p/>
+    <w:p>
+      <w:pPr>
+        <w:pStyle w:val="Overskrift2"/>
+      </w:pPr>
+      <w:bookmarkStart w:id="110" w:name="_Toc222403550"/>
+      <w:r>
         <w:lastRenderedPageBreak/>
-        <w:t xml:space="preserve"> </w:t>
-      </w:r>
-      <w:bookmarkStart w:id="120" w:name="_Toc222403548"/>
-      <w:r>
-        <w:t>Implementering</w:t>
-      </w:r>
-      <w:bookmarkEnd w:id="120"/>
+        <w:t xml:space="preserve">Mappestruktur og </w:t>
+      </w:r>
+      <w:proofErr w:type="spellStart"/>
+      <w:r>
+        <w:t>namespaces</w:t>
+      </w:r>
+      <w:bookmarkEnd w:id="110"/>
+      <w:proofErr w:type="spellEnd"/>
     </w:p>
     <w:p>
       <w:pPr>
         <w:pStyle w:val="Overskrift2"/>
       </w:pPr>
-      <w:bookmarkStart w:id="121" w:name="_Toc222403549"/>
-      <w:r>
-        <w:t>Projektstruktur</w:t>
-      </w:r>
-      <w:bookmarkEnd w:id="121"/>
-    </w:p>
-    <w:p>
-      <w:r>
-        <w:t>Løsningen er opdelt i flere projekter for at sikre klar ansvarsfordeling og lav kobling mellem komponenter.</w:t>
-      </w:r>
-    </w:p>
-    <w:p>
-      <w:r>
-        <w:t>VIGOR indeholder MAUI Blazor Hybrid-applikationen og håndterer brugergrænseflade og klientlogik.</w:t>
-      </w:r>
-      <w:r>
-        <w:br/>
-      </w:r>
-      <w:proofErr w:type="spellStart"/>
-      <w:r>
-        <w:t>VIGOR.Web</w:t>
-      </w:r>
-      <w:proofErr w:type="spellEnd"/>
-      <w:r>
-        <w:t xml:space="preserve"> indeholder serverlogik, API-</w:t>
-      </w:r>
-      <w:proofErr w:type="spellStart"/>
-      <w:r>
-        <w:t>endpoints</w:t>
-      </w:r>
-      <w:proofErr w:type="spellEnd"/>
-      <w:r>
-        <w:t xml:space="preserve"> og dataadgang.</w:t>
-      </w:r>
-      <w:r>
-        <w:br/>
-      </w:r>
-      <w:proofErr w:type="spellStart"/>
-      <w:r>
-        <w:t>VIGOR.Shared</w:t>
-      </w:r>
-      <w:proofErr w:type="spellEnd"/>
-      <w:r>
-        <w:t xml:space="preserve"> indeholder fælles kontrakter, domænemodeller og </w:t>
-      </w:r>
-      <w:proofErr w:type="spellStart"/>
-      <w:r>
-        <w:t>DTO’er</w:t>
-      </w:r>
-      <w:proofErr w:type="spellEnd"/>
-      <w:r>
-        <w:t>, som deles mellem klient og server.</w:t>
-      </w:r>
-    </w:p>
-    <w:p>
-      <w:r>
-        <w:t xml:space="preserve">Denne struktur understøtter lagdeling og separation of </w:t>
-      </w:r>
-      <w:proofErr w:type="spellStart"/>
-      <w:r>
-        <w:t>concerns</w:t>
-      </w:r>
-      <w:proofErr w:type="spellEnd"/>
-      <w:r>
-        <w:t xml:space="preserve"> og gør det muligt at udvikle og teste komponenter isoleret. Projektopdelingen bidrager til </w:t>
-      </w:r>
-      <w:proofErr w:type="spellStart"/>
-      <w:r>
-        <w:t>vedligeholdbarhed</w:t>
-      </w:r>
-      <w:proofErr w:type="spellEnd"/>
-      <w:r>
-        <w:t xml:space="preserve"> og giver fleksibilitet i forhold til fremtidige ændringer eller udvidelser.</w:t>
-      </w:r>
-    </w:p>
-    <w:p/>
+      <w:bookmarkStart w:id="111" w:name="_Toc222403551"/>
+      <w:r>
+        <w:t>Centrale services</w:t>
+      </w:r>
+      <w:bookmarkEnd w:id="111"/>
+    </w:p>
     <w:p>
       <w:pPr>
         <w:pStyle w:val="Overskrift2"/>
       </w:pPr>
-      <w:bookmarkStart w:id="122" w:name="_Toc222403550"/>
-      <w:r>
-        <w:t xml:space="preserve">Mappestruktur og </w:t>
-      </w:r>
-      <w:proofErr w:type="spellStart"/>
-      <w:r>
-        <w:t>namespaces</w:t>
-      </w:r>
-      <w:bookmarkEnd w:id="122"/>
-      <w:proofErr w:type="spellEnd"/>
+      <w:bookmarkStart w:id="112" w:name="_Toc222403552"/>
+      <w:r>
+        <w:t>Teststrategi</w:t>
+      </w:r>
+      <w:bookmarkEnd w:id="112"/>
     </w:p>
     <w:p>
       <w:pPr>
         <w:pStyle w:val="Overskrift2"/>
       </w:pPr>
-      <w:bookmarkStart w:id="123" w:name="_Toc222403551"/>
-      <w:r>
-        <w:t>Centrale services</w:t>
-      </w:r>
-      <w:bookmarkEnd w:id="123"/>
-    </w:p>
-    <w:p>
-      <w:pPr>
-        <w:pStyle w:val="Overskrift2"/>
-      </w:pPr>
-      <w:bookmarkStart w:id="124" w:name="_Toc222403552"/>
-      <w:r>
-        <w:t>Teststrategi</w:t>
-      </w:r>
-      <w:bookmarkEnd w:id="124"/>
-    </w:p>
-    <w:p>
-      <w:pPr>
-        <w:pStyle w:val="Overskrift2"/>
-      </w:pPr>
-      <w:bookmarkStart w:id="125" w:name="_Toc222403553"/>
+      <w:bookmarkStart w:id="113" w:name="_Toc222403553"/>
       <w:r>
         <w:t>Eksempler på kode</w:t>
       </w:r>
-      <w:bookmarkEnd w:id="125"/>
+      <w:bookmarkEnd w:id="113"/>
     </w:p>
     <w:p>
       <w:r>
@@ -19098,51 +19603,51 @@
       <w:r>
         <w:t xml:space="preserve"> </w:t>
       </w:r>
-      <w:bookmarkStart w:id="126" w:name="_Toc222403554"/>
+      <w:bookmarkStart w:id="114" w:name="_Toc222403554"/>
       <w:r>
         <w:t>Test og Kvalitet</w:t>
       </w:r>
-      <w:bookmarkEnd w:id="126"/>
+      <w:bookmarkEnd w:id="114"/>
     </w:p>
     <w:p>
       <w:pPr>
         <w:pStyle w:val="Overskrift2"/>
       </w:pPr>
-      <w:bookmarkStart w:id="127" w:name="_Toc222403555"/>
+      <w:bookmarkStart w:id="115" w:name="_Toc222403555"/>
       <w:r>
         <w:t>Unit tests</w:t>
       </w:r>
-      <w:bookmarkEnd w:id="127"/>
+      <w:bookmarkEnd w:id="115"/>
     </w:p>
     <w:p>
       <w:pPr>
         <w:pStyle w:val="Overskrift2"/>
       </w:pPr>
-      <w:bookmarkStart w:id="128" w:name="_Toc222403556"/>
+      <w:bookmarkStart w:id="116" w:name="_Toc222403556"/>
       <w:r>
         <w:t>Integrationstest</w:t>
       </w:r>
-      <w:bookmarkEnd w:id="128"/>
+      <w:bookmarkEnd w:id="116"/>
     </w:p>
     <w:p>
       <w:pPr>
         <w:pStyle w:val="Overskrift2"/>
       </w:pPr>
-      <w:bookmarkStart w:id="129" w:name="_Toc222403557"/>
+      <w:bookmarkStart w:id="117" w:name="_Toc222403557"/>
       <w:r>
         <w:t>Manuel test</w:t>
       </w:r>
-      <w:bookmarkEnd w:id="129"/>
+      <w:bookmarkEnd w:id="117"/>
     </w:p>
     <w:p>
       <w:pPr>
         <w:pStyle w:val="Overskrift2"/>
       </w:pPr>
-      <w:bookmarkStart w:id="130" w:name="_Toc222403558"/>
+      <w:bookmarkStart w:id="118" w:name="_Toc222403558"/>
       <w:r>
         <w:t>Kvalitetssikring</w:t>
       </w:r>
-      <w:bookmarkEnd w:id="130"/>
+      <w:bookmarkEnd w:id="118"/>
     </w:p>
     <w:p>
       <w:r>
@@ -19156,54 +19661,53 @@
         <w:pStyle w:val="Overskrift1"/>
       </w:pPr>
       <w:r>
-        <w:lastRenderedPageBreak/>
         <w:t xml:space="preserve"> </w:t>
       </w:r>
-      <w:bookmarkStart w:id="131" w:name="_Toc222403559"/>
+      <w:bookmarkStart w:id="119" w:name="_Toc222403559"/>
       <w:r>
         <w:t>Refleksion</w:t>
       </w:r>
-      <w:bookmarkEnd w:id="131"/>
+      <w:bookmarkEnd w:id="119"/>
     </w:p>
     <w:p>
       <w:pPr>
         <w:pStyle w:val="Overskrift2"/>
       </w:pPr>
-      <w:bookmarkStart w:id="132" w:name="_Toc222403560"/>
+      <w:bookmarkStart w:id="120" w:name="_Toc222403560"/>
       <w:r>
         <w:t>Metoderefleksion</w:t>
       </w:r>
-      <w:bookmarkEnd w:id="132"/>
+      <w:bookmarkEnd w:id="120"/>
     </w:p>
     <w:p>
       <w:pPr>
         <w:pStyle w:val="Overskrift2"/>
       </w:pPr>
-      <w:bookmarkStart w:id="133" w:name="_Toc222403561"/>
+      <w:bookmarkStart w:id="121" w:name="_Toc222403561"/>
       <w:r>
         <w:t>Samarbejde og iterationer</w:t>
       </w:r>
-      <w:bookmarkEnd w:id="133"/>
+      <w:bookmarkEnd w:id="121"/>
     </w:p>
     <w:p>
       <w:pPr>
         <w:pStyle w:val="Overskrift2"/>
       </w:pPr>
-      <w:bookmarkStart w:id="134" w:name="_Toc222403562"/>
+      <w:bookmarkStart w:id="122" w:name="_Toc222403562"/>
       <w:r>
         <w:t>Hvad fungerede godt</w:t>
       </w:r>
-      <w:bookmarkEnd w:id="134"/>
+      <w:bookmarkEnd w:id="122"/>
     </w:p>
     <w:p>
       <w:pPr>
         <w:pStyle w:val="Overskrift2"/>
       </w:pPr>
-      <w:bookmarkStart w:id="135" w:name="_Toc222403563"/>
+      <w:bookmarkStart w:id="123" w:name="_Toc222403563"/>
       <w:r>
         <w:t>Hvad kunne forbedres</w:t>
       </w:r>
-      <w:bookmarkEnd w:id="135"/>
+      <w:bookmarkEnd w:id="123"/>
     </w:p>
     <w:p>
       <w:r>
@@ -19219,31 +19723,31 @@
       <w:r>
         <w:t xml:space="preserve"> </w:t>
       </w:r>
-      <w:bookmarkStart w:id="136" w:name="_Toc222403564"/>
+      <w:bookmarkStart w:id="124" w:name="_Toc222403564"/>
       <w:r>
         <w:t>Konklusion</w:t>
       </w:r>
-      <w:bookmarkEnd w:id="136"/>
+      <w:bookmarkEnd w:id="124"/>
     </w:p>
     <w:p>
       <w:pPr>
         <w:pStyle w:val="Overskrift2"/>
       </w:pPr>
-      <w:bookmarkStart w:id="137" w:name="_Toc222403565"/>
+      <w:bookmarkStart w:id="125" w:name="_Toc222403565"/>
       <w:r>
         <w:t>Opfyldelse af problemformulering</w:t>
       </w:r>
-      <w:bookmarkEnd w:id="137"/>
+      <w:bookmarkEnd w:id="125"/>
     </w:p>
     <w:p>
       <w:pPr>
         <w:pStyle w:val="Overskrift2"/>
       </w:pPr>
-      <w:bookmarkStart w:id="138" w:name="_Toc222403566"/>
+      <w:bookmarkStart w:id="126" w:name="_Toc222403566"/>
       <w:r>
         <w:t>Fremtidige udvidelser</w:t>
       </w:r>
-      <w:bookmarkEnd w:id="138"/>
+      <w:bookmarkEnd w:id="126"/>
     </w:p>
     <w:p>
       <w:r>
@@ -19257,13 +19761,14 @@
         <w:pStyle w:val="Overskrift1"/>
       </w:pPr>
       <w:r>
+        <w:lastRenderedPageBreak/>
         <w:t xml:space="preserve"> </w:t>
       </w:r>
-      <w:bookmarkStart w:id="139" w:name="_Toc222403567"/>
+      <w:bookmarkStart w:id="127" w:name="_Toc222403567"/>
       <w:r>
         <w:t>Referencer</w:t>
       </w:r>
-      <w:bookmarkEnd w:id="139"/>
+      <w:bookmarkEnd w:id="127"/>
     </w:p>
     <w:p>
       <w:r>
@@ -19277,29 +19782,30 @@
         <w:pStyle w:val="Overskrift1"/>
       </w:pPr>
       <w:r>
+        <w:lastRenderedPageBreak/>
         <w:t xml:space="preserve"> </w:t>
       </w:r>
-      <w:bookmarkStart w:id="140" w:name="_Toc222403568"/>
+      <w:bookmarkStart w:id="128" w:name="_Toc222403568"/>
       <w:r>
         <w:t>Bilag</w:t>
       </w:r>
-      <w:bookmarkEnd w:id="140"/>
+      <w:bookmarkEnd w:id="128"/>
     </w:p>
     <w:p>
       <w:pPr>
         <w:pStyle w:val="Overskrift2"/>
       </w:pPr>
-      <w:bookmarkStart w:id="141" w:name="_Toc222403569"/>
+      <w:bookmarkStart w:id="129" w:name="_Toc222403569"/>
       <w:r>
         <w:t>Ekstra diagrammer</w:t>
       </w:r>
-      <w:bookmarkEnd w:id="141"/>
+      <w:bookmarkEnd w:id="129"/>
     </w:p>
     <w:p>
       <w:pPr>
         <w:pStyle w:val="Overskrift2"/>
       </w:pPr>
-      <w:bookmarkStart w:id="142" w:name="_Toc222403570"/>
+      <w:bookmarkStart w:id="130" w:name="_Toc222403570"/>
       <w:r>
         <w:t xml:space="preserve">Ekstra </w:t>
       </w:r>
@@ -19311,27 +19817,97 @@
       <w:r>
         <w:t xml:space="preserve"> cases</w:t>
       </w:r>
-      <w:bookmarkEnd w:id="142"/>
-    </w:p>
+      <w:bookmarkEnd w:id="130"/>
+    </w:p>
+    <w:p>
+      <w:pPr>
+        <w:spacing w:after="0" w:line="240" w:lineRule="auto"/>
+        <w:rPr>
+          <w:rFonts w:ascii="Times New Roman" w:eastAsia="Times New Roman" w:hAnsi="Times New Roman" w:cs="Times New Roman"/>
+          <w:kern w:val="0"/>
+          <w:lang w:eastAsia="da-DK"/>
+          <w14:ligatures w14:val="none"/>
+        </w:rPr>
+      </w:pPr>
+      <w:r>
+        <w:rPr>
+          <w:rFonts w:ascii="Times New Roman" w:eastAsia="Times New Roman" w:hAnsi="Times New Roman" w:cs="Times New Roman"/>
+          <w:noProof/>
+          <w:kern w:val="0"/>
+          <w:lang w:eastAsia="da-DK"/>
+          <w14:ligatures w14:val="none"/>
+        </w:rPr>
+        <w:lastRenderedPageBreak/>
+        <w:drawing>
+          <wp:inline distT="0" distB="0" distL="0" distR="0" wp14:anchorId="24EC43FB" wp14:editId="1AD59983">
+            <wp:extent cx="2687583" cy="9405680"/>
+            <wp:effectExtent l="0" t="0" r="0" b="0"/>
+            <wp:docPr id="788068167" name="Billede 2" descr="Et billede, der indeholder tekst, sort-hvid, dokument, Font/skrifttype&#10;&#10;AI-genereret indhold kan være ukorrekt."/>
+            <wp:cNvGraphicFramePr>
+              <a:graphicFrameLocks xmlns:a="http://schemas.openxmlformats.org/drawingml/2006/main" noChangeAspect="1"/>
+            </wp:cNvGraphicFramePr>
+            <a:graphic xmlns:a="http://schemas.openxmlformats.org/drawingml/2006/main">
+              <a:graphicData uri="http://schemas.openxmlformats.org/drawingml/2006/picture">
+                <pic:pic xmlns:pic="http://schemas.openxmlformats.org/drawingml/2006/picture">
+                  <pic:nvPicPr>
+                    <pic:cNvPr id="788068167" name="Billede 2" descr="Et billede, der indeholder tekst, sort-hvid, dokument, Font/skrifttype&#10;&#10;AI-genereret indhold kan være ukorrekt."/>
+                    <pic:cNvPicPr>
+                      <a:picLocks noChangeAspect="1" noChangeArrowheads="1"/>
+                    </pic:cNvPicPr>
+                  </pic:nvPicPr>
+                  <pic:blipFill>
+                    <a:blip r:embed="rId18" cstate="print">
+                      <a:extLst>
+                        <a:ext uri="{28A0092B-C50C-407E-A947-70E740481C1C}">
+                          <a14:useLocalDpi xmlns:a14="http://schemas.microsoft.com/office/drawing/2010/main" val="0"/>
+                        </a:ext>
+                      </a:extLst>
+                    </a:blip>
+                    <a:srcRect/>
+                    <a:stretch>
+                      <a:fillRect/>
+                    </a:stretch>
+                  </pic:blipFill>
+                  <pic:spPr bwMode="auto">
+                    <a:xfrm>
+                      <a:off x="0" y="0"/>
+                      <a:ext cx="2696417" cy="9436596"/>
+                    </a:xfrm>
+                    <a:prstGeom prst="rect">
+                      <a:avLst/>
+                    </a:prstGeom>
+                    <a:noFill/>
+                    <a:ln>
+                      <a:noFill/>
+                    </a:ln>
+                  </pic:spPr>
+                </pic:pic>
+              </a:graphicData>
+            </a:graphic>
+          </wp:inline>
+        </w:drawing>
+      </w:r>
+    </w:p>
+    <w:p/>
     <w:p>
       <w:pPr>
         <w:pStyle w:val="Overskrift2"/>
       </w:pPr>
-      <w:bookmarkStart w:id="143" w:name="_Toc222403571"/>
+      <w:bookmarkStart w:id="131" w:name="_Toc222403571"/>
       <w:r>
         <w:t>Screenshots</w:t>
       </w:r>
-      <w:bookmarkEnd w:id="143"/>
+      <w:bookmarkEnd w:id="131"/>
     </w:p>
     <w:p>
       <w:pPr>
         <w:pStyle w:val="Overskrift2"/>
       </w:pPr>
-      <w:bookmarkStart w:id="144" w:name="_Toc222403572"/>
+      <w:bookmarkStart w:id="132" w:name="_Toc222403572"/>
       <w:r>
         <w:t>GitHub link</w:t>
       </w:r>
-      <w:bookmarkEnd w:id="144"/>
+      <w:bookmarkEnd w:id="132"/>
     </w:p>
     <w:p/>
     <w:sectPr>
@@ -20124,7 +20700,7 @@
       <w:lvlText w:val="%1.%2.%3"/>
       <w:lvlJc w:val="left"/>
       <w:pPr>
-        <w:ind w:left="720" w:hanging="720"/>
+        <w:ind w:left="5256" w:hanging="720"/>
       </w:pPr>
     </w:lvl>
     <w:lvl w:ilvl="3">
@@ -22957,6 +23533,7 @@
         <w:numId w:val="7"/>
       </w:numPr>
       <w:spacing w:before="160" w:after="80"/>
+      <w:ind w:left="720"/>
       <w:outlineLvl w:val="2"/>
     </w:pPr>
     <w:rPr>
@@ -23671,6 +24248,17 @@
       <w14:ligatures w14:val="none"/>
     </w:rPr>
   </w:style>
+  <w:style w:type="character" w:styleId="Strk">
+    <w:name w:val="Strong"/>
+    <w:basedOn w:val="Standardskrifttypeiafsnit"/>
+    <w:uiPriority w:val="22"/>
+    <w:qFormat/>
+    <w:rsid w:val="008D29E7"/>
+    <w:rPr>
+      <w:b/>
+      <w:bCs/>
+    </w:rPr>
+  </w:style>
 </w:styles>
 </file>
 
@@ -23729,6 +24317,37 @@
         <w:p>
           <w:pPr>
             <w:pStyle w:val="23EFB5BC58A948368BE69FC3AE5F9E85"/>
+          </w:pPr>
+          <w:r>
+            <w:rPr>
+              <w:color w:val="156082" w:themeColor="accent1"/>
+              <w:sz w:val="28"/>
+              <w:szCs w:val="28"/>
+            </w:rPr>
+            <w:t>[Dokumentets undertitel]</w:t>
+          </w:r>
+        </w:p>
+      </w:docPartBody>
+    </w:docPart>
+    <w:docPart>
+      <w:docPartPr>
+        <w:name w:val="192772CA5CE345D5A3E09088CBF89600"/>
+        <w:category>
+          <w:name w:val="Generelt"/>
+          <w:gallery w:val="placeholder"/>
+        </w:category>
+        <w:types>
+          <w:type w:val="bbPlcHdr"/>
+        </w:types>
+        <w:behaviors>
+          <w:behavior w:val="content"/>
+        </w:behaviors>
+        <w:guid w:val="{13662A87-CFFD-4C7F-A8DB-3ACC33AFB37C}"/>
+      </w:docPartPr>
+      <w:docPartBody>
+        <w:p>
+          <w:pPr>
+            <w:pStyle w:val="192772CA5CE345D5A3E09088CBF89600"/>
           </w:pPr>
           <w:r>
             <w:rPr>
@@ -23808,11 +24427,12 @@
   <w:rsids>
     <w:rsidRoot w:val="0029758D"/>
     <w:rsid w:val="0029758D"/>
+    <w:rsid w:val="00347A8F"/>
     <w:rsid w:val="004F4478"/>
     <w:rsid w:val="00634136"/>
     <w:rsid w:val="00772F07"/>
     <w:rsid w:val="009218FD"/>
-    <w:rsid w:val="00B509A9"/>
+    <w:rsid w:val="00A803C1"/>
     <w:rsid w:val="00CA6D42"/>
     <w:rsid w:val="00DD1339"/>
     <w:rsid w:val="00F011B1"/>
@@ -24274,6 +24894,10 @@
     <w:name w:val="23EFB5BC58A948368BE69FC3AE5F9E85"/>
     <w:rsid w:val="0029758D"/>
   </w:style>
+  <w:style w:type="paragraph" w:customStyle="1" w:styleId="192772CA5CE345D5A3E09088CBF89600">
+    <w:name w:val="192772CA5CE345D5A3E09088CBF89600"/>
+    <w:rsid w:val="00A803C1"/>
+  </w:style>
 </w:styles>
 </file>
 

</xml_diff>